<commit_message>
add disable button for limit discount, fix the sales detail report, fix the php mailer
</commit_message>
<xml_diff>
--- a/docs/Chapter2.docx
+++ b/docs/Chapter2.docx
@@ -5,115 +5,130 @@
     <w:p>
       <w:pPr>
         <w:pStyle w:val="BodyText"/>
+        <w:spacing w:line="480" w:lineRule="auto"/>
+        <w:ind w:left="850" w:right="567" w:firstLine="284"/>
+        <w:jc w:val="center"/>
+        <w:rPr>
+          <w:sz w:val="24"/>
+          <w:szCs w:val="24"/>
+        </w:rPr>
+      </w:pPr>
+    </w:p>
+    <w:p>
+      <w:pPr>
+        <w:pStyle w:val="BodyText"/>
+        <w:spacing w:line="480" w:lineRule="auto"/>
+        <w:ind w:left="850" w:right="567" w:firstLine="284"/>
+        <w:jc w:val="center"/>
+        <w:rPr>
+          <w:sz w:val="24"/>
+          <w:szCs w:val="24"/>
+        </w:rPr>
+      </w:pPr>
+    </w:p>
+    <w:p>
+      <w:pPr>
+        <w:pStyle w:val="BodyText"/>
+        <w:spacing w:line="480" w:lineRule="auto"/>
+        <w:ind w:left="850" w:right="567" w:firstLine="284"/>
+        <w:jc w:val="center"/>
+        <w:rPr>
+          <w:sz w:val="24"/>
+          <w:szCs w:val="24"/>
+        </w:rPr>
+      </w:pPr>
+    </w:p>
+    <w:p>
+      <w:pPr>
+        <w:pStyle w:val="BodyText"/>
+        <w:spacing w:line="480" w:lineRule="auto"/>
+        <w:ind w:left="850" w:right="567" w:firstLine="284"/>
+        <w:jc w:val="center"/>
         <w:rPr>
           <w:b/>
           <w:bCs/>
-          <w:sz w:val="40"/>
-          <w:szCs w:val="40"/>
+          <w:sz w:val="24"/>
+          <w:szCs w:val="24"/>
         </w:rPr>
       </w:pPr>
       <w:r>
         <w:rPr>
           <w:b/>
           <w:bCs/>
-          <w:sz w:val="28"/>
-          <w:szCs w:val="28"/>
-        </w:rPr>
-        <w:t xml:space="preserve">       </w:t>
-      </w:r>
-      <w:r>
+          <w:sz w:val="24"/>
+          <w:szCs w:val="24"/>
+        </w:rPr>
+        <w:t>Chapter II</w:t>
+      </w:r>
+    </w:p>
+    <w:p>
+      <w:pPr>
+        <w:pStyle w:val="BodyText"/>
+        <w:spacing w:line="480" w:lineRule="auto"/>
+        <w:ind w:left="850" w:right="567" w:firstLine="284"/>
+        <w:jc w:val="center"/>
         <w:rPr>
           <w:b/>
           <w:bCs/>
-          <w:sz w:val="28"/>
-          <w:szCs w:val="28"/>
-        </w:rPr>
-        <w:tab/>
-      </w:r>
-    </w:p>
-    <w:p>
-      <w:pPr>
-        <w:spacing w:before="240" w:after="120"/>
+          <w:sz w:val="24"/>
+          <w:szCs w:val="24"/>
+        </w:rPr>
+      </w:pPr>
+      <w:r>
         <w:rPr>
           <w:b/>
           <w:bCs/>
-          <w:sz w:val="20"/>
-          <w:szCs w:val="20"/>
-        </w:rPr>
-      </w:pPr>
-      <w:r>
+          <w:sz w:val="24"/>
+          <w:szCs w:val="24"/>
+        </w:rPr>
+        <w:t>Methodology</w:t>
+      </w:r>
+    </w:p>
+    <w:p>
+      <w:pPr>
+        <w:pStyle w:val="BodyText"/>
+        <w:spacing w:line="480" w:lineRule="auto"/>
+        <w:ind w:left="850" w:right="567" w:firstLine="284"/>
+        <w:jc w:val="both"/>
+        <w:rPr>
+          <w:sz w:val="24"/>
+          <w:szCs w:val="24"/>
+        </w:rPr>
+      </w:pPr>
+      <w:r>
+        <w:rPr>
+          <w:sz w:val="24"/>
+          <w:szCs w:val="24"/>
+        </w:rPr>
+        <w:t>This chapter serves as the blueprint or roadmap of the entire study. It explains how the project was carried out, detailing the procedures, techniques, and tools used to design, develop, and evaluate the system or solution. This chapter provides a clear and systematic description of the research or development process, ensuring that the study is transparent, replicable, and scientifically sound.</w:t>
+      </w:r>
+    </w:p>
+    <w:p>
+      <w:pPr>
+        <w:spacing w:before="240" w:after="120" w:line="480" w:lineRule="auto"/>
+        <w:ind w:left="850" w:right="567"/>
+        <w:jc w:val="both"/>
         <w:rPr>
           <w:b/>
           <w:bCs/>
-          <w:sz w:val="40"/>
-          <w:szCs w:val="40"/>
-        </w:rPr>
-        <w:t>Research Design</w:t>
-      </w:r>
-    </w:p>
-    <w:p>
-      <w:pPr>
-        <w:spacing w:before="240" w:after="120"/>
-        <w:jc w:val="both"/>
-        <w:rPr>
-          <w:sz w:val="24"/>
-          <w:szCs w:val="24"/>
-          <w:lang w:val="en-PH"/>
-        </w:rPr>
-      </w:pPr>
-      <w:r>
-        <w:rPr>
-          <w:sz w:val="24"/>
-          <w:szCs w:val="24"/>
-          <w:lang w:val="en-PH"/>
-        </w:rPr>
-        <w:tab/>
-      </w:r>
-      <w:r>
-        <w:rPr>
-          <w:sz w:val="24"/>
-          <w:szCs w:val="24"/>
-          <w:lang w:val="en-PH"/>
-        </w:rPr>
-        <w:t xml:space="preserve">This study will </w:t>
-      </w:r>
-      <w:r>
-        <w:rPr>
-          <w:sz w:val="24"/>
-          <w:szCs w:val="24"/>
-        </w:rPr>
-        <w:t xml:space="preserve">utilize </w:t>
-      </w:r>
-      <w:r>
-        <w:rPr>
-          <w:sz w:val="24"/>
-          <w:szCs w:val="24"/>
-          <w:lang w:val="en-PH"/>
-        </w:rPr>
-        <w:t xml:space="preserve">a </w:t>
-      </w:r>
+          <w:sz w:val="24"/>
+          <w:szCs w:val="24"/>
+        </w:rPr>
+      </w:pPr>
       <w:r>
         <w:rPr>
           <w:b/>
           <w:bCs/>
           <w:sz w:val="24"/>
           <w:szCs w:val="24"/>
-          <w:lang w:val="en-PH"/>
-        </w:rPr>
-        <w:t>Developmental Research Design</w:t>
-      </w:r>
-      <w:r>
-        <w:rPr>
-          <w:sz w:val="24"/>
-          <w:szCs w:val="24"/>
-          <w:lang w:val="en-PH"/>
-        </w:rPr>
-        <w:t xml:space="preserve"> to create and develop a Web-Based Inventory and Point-of-Sale System for MMB Drug Store. It aims to examine the existing inventory and sales procedures, identify issues associated with manual record-keeping, and develop a computerized solution that enhances efficiency and accuracy.</w:t>
-      </w:r>
-    </w:p>
-    <w:p>
-      <w:pPr>
-        <w:spacing w:before="240" w:after="120"/>
+        </w:rPr>
+        <w:t>Research Design</w:t>
+      </w:r>
+    </w:p>
+    <w:p>
+      <w:pPr>
+        <w:spacing w:before="240" w:after="120" w:line="480" w:lineRule="auto"/>
+        <w:ind w:left="850" w:right="567" w:firstLine="284"/>
         <w:jc w:val="both"/>
         <w:rPr>
           <w:sz w:val="24"/>
@@ -135,7 +150,22 @@
           <w:szCs w:val="24"/>
           <w:lang w:val="en-PH"/>
         </w:rPr>
-        <w:t xml:space="preserve">The system development will follow the </w:t>
+        <w:t xml:space="preserve">This study will </w:t>
+      </w:r>
+      <w:r>
+        <w:rPr>
+          <w:sz w:val="24"/>
+          <w:szCs w:val="24"/>
+        </w:rPr>
+        <w:t xml:space="preserve">utilize </w:t>
+      </w:r>
+      <w:r>
+        <w:rPr>
+          <w:sz w:val="24"/>
+          <w:szCs w:val="24"/>
+          <w:lang w:val="en-PH"/>
+        </w:rPr>
+        <w:t xml:space="preserve">a </w:t>
       </w:r>
       <w:r>
         <w:rPr>
@@ -145,88 +175,21 @@
           <w:szCs w:val="24"/>
           <w:lang w:val="en-PH"/>
         </w:rPr>
-        <w:t>System Development Life Cycle (SDLC)</w:t>
-      </w:r>
-      <w:r>
-        <w:rPr>
-          <w:sz w:val="24"/>
-          <w:szCs w:val="24"/>
-          <w:lang w:val="en-PH"/>
-        </w:rPr>
-        <w:t xml:space="preserve">, which includes the stages of planning, analysis, design, development, testing, and implementation. During the analysis stage, relevant </w:t>
-      </w:r>
-      <w:r>
-        <w:rPr>
-          <w:sz w:val="24"/>
-          <w:szCs w:val="24"/>
-        </w:rPr>
-        <w:t xml:space="preserve">data will be collected through </w:t>
-      </w:r>
-      <w:r>
-        <w:rPr>
-          <w:sz w:val="24"/>
-          <w:szCs w:val="24"/>
-        </w:rPr>
-        <w:t xml:space="preserve">a </w:t>
-      </w:r>
-      <w:r>
-        <w:rPr>
-          <w:sz w:val="24"/>
-          <w:szCs w:val="24"/>
-        </w:rPr>
-        <w:t>survey questionnaire</w:t>
-      </w:r>
-      <w:r>
-        <w:rPr>
-          <w:sz w:val="24"/>
-          <w:szCs w:val="24"/>
-        </w:rPr>
-        <w:t xml:space="preserve"> </w:t>
-      </w:r>
-      <w:r>
-        <w:rPr>
-          <w:sz w:val="24"/>
-          <w:szCs w:val="24"/>
-          <w:lang w:val="en-PH"/>
-        </w:rPr>
-        <w:t xml:space="preserve">involving the store </w:t>
-      </w:r>
-      <w:r>
-        <w:rPr>
-          <w:sz w:val="24"/>
-          <w:szCs w:val="24"/>
-          <w:lang w:val="en-PH"/>
-        </w:rPr>
-        <w:t xml:space="preserve">owner, </w:t>
-      </w:r>
-      <w:r>
-        <w:rPr>
-          <w:sz w:val="24"/>
-          <w:szCs w:val="24"/>
-          <w:lang w:val="en-PH"/>
-        </w:rPr>
-        <w:t>administrator</w:t>
-      </w:r>
-      <w:r>
-        <w:rPr>
-          <w:sz w:val="24"/>
-          <w:szCs w:val="24"/>
-          <w:lang w:val="en-PH"/>
-        </w:rPr>
-        <w:t xml:space="preserve">, </w:t>
-      </w:r>
-      <w:r>
-        <w:rPr>
-          <w:sz w:val="24"/>
-          <w:szCs w:val="24"/>
-          <w:lang w:val="en-PH"/>
-        </w:rPr>
-        <w:t>and staff.</w:t>
-      </w:r>
-    </w:p>
-    <w:p>
-      <w:pPr>
-        <w:spacing w:before="240" w:after="120"/>
+        <w:t>Developmental Research Design</w:t>
+      </w:r>
+      <w:r>
+        <w:rPr>
+          <w:sz w:val="24"/>
+          <w:szCs w:val="24"/>
+          <w:lang w:val="en-PH"/>
+        </w:rPr>
+        <w:t xml:space="preserve"> to create and develop a Web-Based Inventory and Point-of-Sale System for MMB Drug Store. It aims to examine the existing inventory and sales procedures, identify issues associated with manual record-keeping, and develop a computerized solution that enhances efficiency and accuracy.</w:t>
+      </w:r>
+    </w:p>
+    <w:p>
+      <w:pPr>
+        <w:spacing w:before="240" w:after="120" w:line="480" w:lineRule="auto"/>
+        <w:ind w:left="850" w:right="567" w:firstLine="284"/>
         <w:jc w:val="both"/>
         <w:rPr>
           <w:sz w:val="24"/>
@@ -248,160 +211,271 @@
           <w:szCs w:val="24"/>
           <w:lang w:val="en-PH"/>
         </w:rPr>
-        <w:t>Once the system has been developed, it will be evaluated by selected respondents using a survey questionnaire. The evaluation will focus on key such as functionality, usability, reliability, efficiency, and security. This approach ensures that the developed system is both effective and suitable for improving store operations.</w:t>
-      </w:r>
-    </w:p>
-    <w:p>
-      <w:pPr>
-        <w:tabs>
-          <w:tab w:val="left" w:pos="2088"/>
-        </w:tabs>
-        <w:spacing w:before="240" w:after="120"/>
+        <w:t xml:space="preserve">The system development will follow the </w:t>
+      </w:r>
+      <w:r>
         <w:rPr>
           <w:b/>
           <w:bCs/>
-          <w:sz w:val="40"/>
-          <w:szCs w:val="40"/>
-        </w:rPr>
-      </w:pPr>
-    </w:p>
-    <w:p>
-      <w:pPr>
-        <w:spacing w:before="240" w:after="120"/>
-        <w:rPr>
-          <w:sz w:val="24"/>
-          <w:szCs w:val="24"/>
-          <w:lang w:val="en-PH"/>
-        </w:rPr>
-      </w:pPr>
-      <w:proofErr w:type="gramStart"/>
-      <w:r>
+          <w:sz w:val="24"/>
+          <w:szCs w:val="24"/>
+          <w:lang w:val="en-PH"/>
+        </w:rPr>
+        <w:t>System Development Life Cycle (SDLC)</w:t>
+      </w:r>
+      <w:r>
+        <w:rPr>
+          <w:sz w:val="24"/>
+          <w:szCs w:val="24"/>
+          <w:lang w:val="en-PH"/>
+        </w:rPr>
+        <w:t xml:space="preserve">, which includes the stages of planning, analysis, design, development, testing, and implementation. During the analysis stage, relevant </w:t>
+      </w:r>
+      <w:r>
+        <w:rPr>
+          <w:sz w:val="24"/>
+          <w:szCs w:val="24"/>
+        </w:rPr>
+        <w:t xml:space="preserve">data will be collected through </w:t>
+      </w:r>
+      <w:r>
+        <w:rPr>
+          <w:sz w:val="24"/>
+          <w:szCs w:val="24"/>
+        </w:rPr>
+        <w:t xml:space="preserve">a </w:t>
+      </w:r>
+      <w:r>
+        <w:rPr>
+          <w:sz w:val="24"/>
+          <w:szCs w:val="24"/>
+        </w:rPr>
+        <w:t xml:space="preserve">survey questionnaire </w:t>
+      </w:r>
+      <w:r>
+        <w:rPr>
+          <w:sz w:val="24"/>
+          <w:szCs w:val="24"/>
+          <w:lang w:val="en-PH"/>
+        </w:rPr>
+        <w:t xml:space="preserve">involving the store </w:t>
+      </w:r>
+      <w:r>
+        <w:rPr>
+          <w:sz w:val="24"/>
+          <w:szCs w:val="24"/>
+          <w:lang w:val="en-PH"/>
+        </w:rPr>
+        <w:t xml:space="preserve">owner, </w:t>
+      </w:r>
+      <w:r>
+        <w:rPr>
+          <w:sz w:val="24"/>
+          <w:szCs w:val="24"/>
+          <w:lang w:val="en-PH"/>
+        </w:rPr>
+        <w:t>administrator</w:t>
+      </w:r>
+      <w:r>
+        <w:rPr>
+          <w:sz w:val="24"/>
+          <w:szCs w:val="24"/>
+          <w:lang w:val="en-PH"/>
+        </w:rPr>
+        <w:t xml:space="preserve">, </w:t>
+      </w:r>
+      <w:r>
+        <w:rPr>
+          <w:sz w:val="24"/>
+          <w:szCs w:val="24"/>
+          <w:lang w:val="en-PH"/>
+        </w:rPr>
+        <w:t>and staff.</w:t>
+      </w:r>
+    </w:p>
+    <w:p>
+      <w:pPr>
+        <w:spacing w:before="240" w:after="120" w:line="480" w:lineRule="auto"/>
+        <w:ind w:left="850" w:right="567" w:firstLine="284"/>
+        <w:jc w:val="both"/>
+        <w:rPr>
+          <w:sz w:val="24"/>
+          <w:szCs w:val="24"/>
+          <w:lang w:val="en-PH"/>
+        </w:rPr>
+      </w:pPr>
+      <w:r>
+        <w:rPr>
+          <w:sz w:val="24"/>
+          <w:szCs w:val="24"/>
+          <w:lang w:val="en-PH"/>
+        </w:rPr>
+        <w:tab/>
+      </w:r>
+      <w:r>
+        <w:rPr>
+          <w:sz w:val="24"/>
+          <w:szCs w:val="24"/>
+          <w:lang w:val="en-PH"/>
+        </w:rPr>
+        <w:t>Once the system has been developed, it will be evaluated by selected respondents using a survey questionnaire. The evaluation will focus on key such as functionality, usability, reliability, efficiency, and security. This approach ensures that the developed system is both effective and suitable for improving store operations.</w:t>
+      </w:r>
+    </w:p>
+    <w:p>
+      <w:pPr>
+        <w:spacing w:before="240" w:after="120" w:line="480" w:lineRule="auto"/>
+        <w:ind w:left="850" w:right="567" w:firstLine="284"/>
+        <w:jc w:val="both"/>
+        <w:rPr>
+          <w:sz w:val="24"/>
+          <w:szCs w:val="24"/>
+          <w:lang w:val="en-PH"/>
+        </w:rPr>
+      </w:pPr>
+    </w:p>
+    <w:p>
+      <w:pPr>
+        <w:tabs>
+          <w:tab w:val="left" w:pos="2088"/>
+        </w:tabs>
+        <w:spacing w:before="240" w:after="120" w:line="480" w:lineRule="auto"/>
+        <w:ind w:left="850" w:right="567" w:firstLine="284"/>
         <w:rPr>
           <w:b/>
           <w:bCs/>
-          <w:sz w:val="40"/>
-          <w:szCs w:val="40"/>
-        </w:rPr>
-        <w:t>Locale</w:t>
-      </w:r>
-      <w:proofErr w:type="gramEnd"/>
+          <w:sz w:val="24"/>
+          <w:szCs w:val="24"/>
+        </w:rPr>
+      </w:pPr>
+    </w:p>
+    <w:p>
+      <w:pPr>
+        <w:spacing w:before="240" w:after="120" w:line="480" w:lineRule="auto"/>
+        <w:ind w:left="850" w:right="567"/>
+        <w:rPr>
+          <w:sz w:val="24"/>
+          <w:szCs w:val="24"/>
+          <w:lang w:val="en-PH"/>
+        </w:rPr>
+      </w:pPr>
       <w:r>
         <w:rPr>
           <w:b/>
           <w:bCs/>
-          <w:sz w:val="40"/>
-          <w:szCs w:val="40"/>
-        </w:rPr>
-        <w:t xml:space="preserve"> of </w:t>
-      </w:r>
-      <w:proofErr w:type="gramStart"/>
-      <w:r>
+          <w:sz w:val="24"/>
+          <w:szCs w:val="24"/>
+        </w:rPr>
+        <w:t>Locale of the Study</w:t>
+      </w:r>
+    </w:p>
+    <w:p>
+      <w:pPr>
+        <w:spacing w:before="240" w:after="120" w:line="480" w:lineRule="auto"/>
+        <w:ind w:left="850" w:right="567" w:firstLine="284"/>
+        <w:jc w:val="both"/>
+        <w:rPr>
+          <w:sz w:val="24"/>
+          <w:szCs w:val="24"/>
+          <w:lang w:val="en-PH"/>
+        </w:rPr>
+      </w:pPr>
+      <w:r>
+        <w:rPr>
+          <w:sz w:val="24"/>
+          <w:szCs w:val="24"/>
+          <w:lang w:val="en-PH"/>
+        </w:rPr>
+        <w:t>The study will be conducted at MMB Drug Store located in Niyugan, Jaen, Nueva Ecija, Philippines. The store provides medicines and other health-related products to the local community.</w:t>
+      </w:r>
+    </w:p>
+    <w:p>
+      <w:pPr>
+        <w:spacing w:before="240" w:after="120" w:line="480" w:lineRule="auto"/>
+        <w:ind w:left="850" w:right="567" w:firstLine="284"/>
+        <w:jc w:val="both"/>
+        <w:rPr>
+          <w:sz w:val="24"/>
+          <w:szCs w:val="24"/>
+          <w:lang w:val="en-PH"/>
+        </w:rPr>
+      </w:pPr>
+      <w:r>
+        <w:rPr>
+          <w:sz w:val="24"/>
+          <w:szCs w:val="24"/>
+          <w:lang w:val="en-PH"/>
+        </w:rPr>
+        <w:tab/>
+        <w:t>Currently, the store manages inventory and sales transactions using manual or less organized methods such as handwritten records and basic spreadsheets. As the number of transactions increases, managing these records becomes more difficult and prone to errors.</w:t>
+      </w:r>
+    </w:p>
+    <w:p>
+      <w:pPr>
+        <w:spacing w:before="240" w:after="120" w:line="480" w:lineRule="auto"/>
+        <w:ind w:left="850" w:right="567" w:firstLine="284"/>
+        <w:jc w:val="both"/>
+        <w:rPr>
+          <w:sz w:val="24"/>
+          <w:szCs w:val="24"/>
+          <w:lang w:val="en-PH"/>
+        </w:rPr>
+      </w:pPr>
+      <w:r>
+        <w:rPr>
+          <w:sz w:val="24"/>
+          <w:szCs w:val="24"/>
+          <w:lang w:val="en-PH"/>
+        </w:rPr>
+        <w:tab/>
+        <w:t>The researchers selected this location because the store requires a more efficient and reliable system to manage inventory and sales operations. The proposed system will be implemented to improve efficiency, accuracy, and overall business performance</w:t>
+      </w:r>
+      <w:r>
+        <w:rPr>
+          <w:sz w:val="24"/>
+          <w:szCs w:val="24"/>
+          <w:lang w:val="en-PH"/>
+        </w:rPr>
+        <w:t>.</w:t>
+      </w:r>
+    </w:p>
+    <w:p>
+      <w:pPr>
+        <w:spacing w:before="240" w:after="120" w:line="480" w:lineRule="auto"/>
+        <w:ind w:left="850" w:right="567" w:firstLine="284"/>
+        <w:jc w:val="both"/>
+        <w:rPr>
+          <w:sz w:val="24"/>
+          <w:szCs w:val="24"/>
+          <w:lang w:val="en-PH"/>
+        </w:rPr>
+      </w:pPr>
+    </w:p>
+    <w:p>
+      <w:pPr>
+        <w:spacing w:before="240" w:after="120" w:line="480" w:lineRule="auto"/>
+        <w:ind w:left="850" w:right="567"/>
         <w:rPr>
           <w:b/>
           <w:bCs/>
-          <w:sz w:val="40"/>
-          <w:szCs w:val="40"/>
-        </w:rPr>
-        <w:t>the Study</w:t>
-      </w:r>
-      <w:proofErr w:type="gramEnd"/>
-    </w:p>
-    <w:p>
-      <w:pPr>
-        <w:spacing w:before="240" w:after="120"/>
-        <w:jc w:val="both"/>
-        <w:rPr>
-          <w:sz w:val="24"/>
-          <w:szCs w:val="24"/>
-          <w:lang w:val="en-PH"/>
-        </w:rPr>
-      </w:pPr>
-      <w:r>
-        <w:rPr>
-          <w:sz w:val="24"/>
-          <w:szCs w:val="24"/>
-          <w:lang w:val="en-PH"/>
-        </w:rPr>
-        <w:tab/>
-        <w:t>The study will be conducted at MMB Drug Store located in Niyugan, Jaen, Nueva Ecija, Philippines. The store provides medicines and other health-related products to the local community.</w:t>
-      </w:r>
-    </w:p>
-    <w:p>
-      <w:pPr>
-        <w:spacing w:before="240" w:after="120"/>
-        <w:jc w:val="both"/>
-        <w:rPr>
-          <w:sz w:val="24"/>
-          <w:szCs w:val="24"/>
-          <w:lang w:val="en-PH"/>
-        </w:rPr>
-      </w:pPr>
-      <w:r>
-        <w:rPr>
-          <w:sz w:val="24"/>
-          <w:szCs w:val="24"/>
-          <w:lang w:val="en-PH"/>
-        </w:rPr>
-        <w:tab/>
-        <w:t>Currently, the store manages inventory and sales transactions using manual or less organized methods such as handwritten records and basic spreadsheets. As the number of transactions increases, managing these records becomes more difficult and prone to errors.</w:t>
-      </w:r>
-    </w:p>
-    <w:p>
-      <w:pPr>
-        <w:spacing w:before="240" w:after="120"/>
-        <w:jc w:val="both"/>
-        <w:rPr>
-          <w:sz w:val="24"/>
-          <w:szCs w:val="24"/>
-          <w:lang w:val="en-PH"/>
-        </w:rPr>
-      </w:pPr>
-      <w:r>
-        <w:rPr>
-          <w:sz w:val="24"/>
-          <w:szCs w:val="24"/>
-          <w:lang w:val="en-PH"/>
-        </w:rPr>
-        <w:tab/>
-        <w:t>The researchers selected this location because the store requires a more efficient and reliable system to manage inventory and sales operations. The proposed system will be implemented to improve efficiency, accuracy, and overall business performance</w:t>
-      </w:r>
-    </w:p>
-    <w:p>
-      <w:pPr>
-        <w:spacing w:before="240" w:after="120"/>
-        <w:jc w:val="both"/>
-        <w:rPr>
-          <w:sz w:val="24"/>
-          <w:szCs w:val="24"/>
-          <w:lang w:val="en-PH"/>
-        </w:rPr>
-      </w:pPr>
-    </w:p>
-    <w:p>
-      <w:pPr>
-        <w:spacing w:before="240" w:after="120"/>
+          <w:sz w:val="24"/>
+          <w:szCs w:val="24"/>
+        </w:rPr>
+      </w:pPr>
+      <w:r>
         <w:rPr>
           <w:b/>
           <w:bCs/>
-          <w:sz w:val="32"/>
-          <w:szCs w:val="32"/>
-        </w:rPr>
-      </w:pPr>
+          <w:sz w:val="24"/>
+          <w:szCs w:val="24"/>
+        </w:rPr>
+        <w:t xml:space="preserve">The </w:t>
+      </w:r>
       <w:r>
         <w:rPr>
           <w:b/>
           <w:bCs/>
-          <w:sz w:val="32"/>
-          <w:szCs w:val="32"/>
-        </w:rPr>
-        <w:t xml:space="preserve">The </w:t>
-      </w:r>
-      <w:r>
-        <w:rPr>
-          <w:b/>
-          <w:bCs/>
-          <w:sz w:val="32"/>
-          <w:szCs w:val="32"/>
+          <w:sz w:val="24"/>
+          <w:szCs w:val="24"/>
         </w:rPr>
         <w:t>Respondents</w:t>
       </w:r>
@@ -411,7 +485,8 @@
         <w:widowControl/>
         <w:autoSpaceDE/>
         <w:autoSpaceDN/>
-        <w:spacing w:before="100" w:beforeAutospacing="1" w:after="100" w:afterAutospacing="1"/>
+        <w:spacing w:before="100" w:beforeAutospacing="1" w:after="100" w:afterAutospacing="1" w:line="480" w:lineRule="auto"/>
+        <w:ind w:left="850" w:right="567" w:firstLine="284"/>
         <w:jc w:val="both"/>
         <w:rPr>
           <w:sz w:val="24"/>
@@ -479,7 +554,8 @@
         <w:widowControl/>
         <w:autoSpaceDE/>
         <w:autoSpaceDN/>
-        <w:spacing w:before="100" w:beforeAutospacing="1" w:after="100" w:afterAutospacing="1"/>
+        <w:spacing w:before="100" w:beforeAutospacing="1" w:after="100" w:afterAutospacing="1" w:line="480" w:lineRule="auto"/>
+        <w:ind w:left="850" w:right="567" w:firstLine="284"/>
         <w:jc w:val="both"/>
         <w:rPr>
           <w:sz w:val="24"/>
@@ -487,22 +563,14 @@
           <w:lang w:val="en-PH" w:eastAsia="en-PH"/>
         </w:rPr>
       </w:pPr>
-      <w:r>
-        <w:rPr>
-          <w:sz w:val="24"/>
-          <w:szCs w:val="24"/>
-          <w:lang w:val="en-PH" w:eastAsia="en-PH"/>
-        </w:rPr>
-        <w:lastRenderedPageBreak/>
-        <w:tab/>
-      </w:r>
     </w:p>
     <w:p>
       <w:pPr>
         <w:widowControl/>
         <w:autoSpaceDE/>
         <w:autoSpaceDN/>
-        <w:spacing w:before="100" w:beforeAutospacing="1" w:after="100" w:afterAutospacing="1"/>
+        <w:spacing w:before="100" w:beforeAutospacing="1" w:after="100" w:afterAutospacing="1" w:line="480" w:lineRule="auto"/>
+        <w:ind w:left="850" w:right="567" w:firstLine="284"/>
         <w:jc w:val="both"/>
         <w:rPr>
           <w:sz w:val="24"/>
@@ -510,63 +578,14 @@
           <w:lang w:val="en-PH" w:eastAsia="en-PH"/>
         </w:rPr>
       </w:pPr>
-      <w:r>
-        <w:rPr>
-          <w:sz w:val="24"/>
-          <w:szCs w:val="24"/>
-          <w:lang w:val="en-PH" w:eastAsia="en-PH"/>
-        </w:rPr>
-        <w:tab/>
-      </w:r>
-      <w:r>
-        <w:rPr>
-          <w:sz w:val="24"/>
-          <w:szCs w:val="24"/>
-          <w:lang w:eastAsia="en-PH"/>
-        </w:rPr>
-        <w:t xml:space="preserve">A total of </w:t>
-      </w:r>
-      <w:r>
-        <w:rPr>
-          <w:b/>
-          <w:bCs/>
-          <w:sz w:val="24"/>
-          <w:szCs w:val="24"/>
-          <w:lang w:eastAsia="en-PH"/>
-        </w:rPr>
-        <w:t>three (3) respondents</w:t>
-      </w:r>
-      <w:r>
-        <w:rPr>
-          <w:sz w:val="24"/>
-          <w:szCs w:val="24"/>
-          <w:lang w:eastAsia="en-PH"/>
-        </w:rPr>
-        <w:t xml:space="preserve"> will be selected to participate in the study.</w:t>
-      </w:r>
-      <w:r>
-        <w:rPr>
-          <w:sz w:val="24"/>
-          <w:szCs w:val="24"/>
-          <w:lang w:eastAsia="en-PH"/>
-        </w:rPr>
-        <w:t xml:space="preserve"> </w:t>
-      </w:r>
-      <w:r>
-        <w:rPr>
-          <w:sz w:val="24"/>
-          <w:szCs w:val="24"/>
-          <w:lang w:val="en-PH" w:eastAsia="en-PH"/>
-        </w:rPr>
-        <w:t>The respondents will include individuals who regularly handle inventory records, monitor stock levels, and process sales transactions. They are purposely chosen because of their familiarity with the current workflow, making them capable of providing accurate, reliable, and relevant information needed for the development of the proposed system.</w:t>
-      </w:r>
     </w:p>
     <w:p>
       <w:pPr>
         <w:widowControl/>
         <w:autoSpaceDE/>
         <w:autoSpaceDN/>
-        <w:spacing w:before="100" w:beforeAutospacing="1" w:after="100" w:afterAutospacing="1"/>
+        <w:spacing w:before="100" w:beforeAutospacing="1" w:after="100" w:afterAutospacing="1" w:line="480" w:lineRule="auto"/>
+        <w:ind w:left="850" w:right="567" w:firstLine="284"/>
         <w:jc w:val="both"/>
         <w:rPr>
           <w:sz w:val="24"/>
@@ -574,102 +593,29 @@
           <w:lang w:val="en-PH" w:eastAsia="en-PH"/>
         </w:rPr>
       </w:pPr>
-      <w:r>
-        <w:rPr>
-          <w:sz w:val="24"/>
-          <w:szCs w:val="24"/>
-          <w:lang w:val="en-PH" w:eastAsia="en-PH"/>
-        </w:rPr>
-        <w:tab/>
-      </w:r>
-      <w:r>
-        <w:rPr>
-          <w:sz w:val="24"/>
-          <w:szCs w:val="24"/>
-          <w:lang w:val="en-PH" w:eastAsia="en-PH"/>
-        </w:rPr>
-        <w:t>The respondents will play a significant role in evaluating the proposed Web-Based Inventory and Point-of-Sale System. Their feedback will be used to assess the system’s performance in terms of functionality, usability, reliability, efficiency, and security. Their responses will also help determine whether the system effectively addresses the existing problems and improves the overall operations of MMB Drug Store.</w:t>
-      </w:r>
-    </w:p>
-    <w:p>
-      <w:pPr>
-        <w:spacing w:after="120"/>
-        <w:jc w:val="both"/>
-        <w:rPr>
-          <w:b/>
-          <w:bCs/>
-          <w:sz w:val="40"/>
-          <w:szCs w:val="40"/>
-        </w:rPr>
-      </w:pPr>
-      <w:r>
-        <w:rPr>
-          <w:b/>
-          <w:bCs/>
-          <w:sz w:val="40"/>
-          <w:szCs w:val="40"/>
-        </w:rPr>
-        <w:t>Sampling Procedure</w:t>
-      </w:r>
     </w:p>
     <w:p>
       <w:pPr>
         <w:widowControl/>
         <w:autoSpaceDE/>
         <w:autoSpaceDN/>
-        <w:spacing w:before="100" w:beforeAutospacing="1" w:after="100" w:afterAutospacing="1"/>
+        <w:spacing w:before="100" w:beforeAutospacing="1" w:after="100" w:afterAutospacing="1" w:line="480" w:lineRule="auto"/>
+        <w:ind w:left="850" w:right="567" w:firstLine="284"/>
         <w:jc w:val="both"/>
         <w:rPr>
+          <w:sz w:val="24"/>
+          <w:szCs w:val="24"/>
           <w:lang w:val="en-PH" w:eastAsia="en-PH"/>
         </w:rPr>
       </w:pPr>
-      <w:r>
-        <w:rPr>
-          <w:sz w:val="24"/>
-          <w:szCs w:val="24"/>
-          <w:lang w:val="en-PH" w:eastAsia="en-PH"/>
-        </w:rPr>
-        <w:tab/>
-      </w:r>
-      <w:r>
-        <w:rPr>
-          <w:sz w:val="24"/>
-          <w:szCs w:val="24"/>
-          <w:lang w:val="en-PH" w:eastAsia="en-PH"/>
-        </w:rPr>
-        <w:t xml:space="preserve">This study will utilize </w:t>
-      </w:r>
-      <w:r>
-        <w:rPr>
-          <w:b/>
-          <w:bCs/>
-          <w:sz w:val="24"/>
-          <w:szCs w:val="24"/>
-          <w:lang w:val="en-PH" w:eastAsia="en-PH"/>
-        </w:rPr>
-        <w:t>Purposive Sampling</w:t>
-      </w:r>
-      <w:r>
-        <w:rPr>
-          <w:sz w:val="24"/>
-          <w:szCs w:val="24"/>
-          <w:lang w:val="en-PH" w:eastAsia="en-PH"/>
-        </w:rPr>
-        <w:t xml:space="preserve"> in selecting the respondents. This sampling technique involves intentionally choosing participants based on their knowledge, experience, and active involvement in the daily operations of MMB Drug Store. It ensures that only individuals who are directly related to the processes being studied are included as participants</w:t>
-      </w:r>
-      <w:r>
-        <w:rPr>
-          <w:lang w:val="en-PH" w:eastAsia="en-PH"/>
-        </w:rPr>
-        <w:t>.</w:t>
-      </w:r>
     </w:p>
     <w:p>
       <w:pPr>
         <w:widowControl/>
         <w:autoSpaceDE/>
         <w:autoSpaceDN/>
-        <w:spacing w:before="100" w:beforeAutospacing="1" w:after="100" w:afterAutospacing="1"/>
+        <w:spacing w:before="100" w:beforeAutospacing="1" w:after="100" w:afterAutospacing="1" w:line="480" w:lineRule="auto"/>
+        <w:ind w:left="850" w:right="567" w:firstLine="284"/>
         <w:jc w:val="both"/>
         <w:rPr>
           <w:sz w:val="24"/>
@@ -684,7 +630,40 @@
           <w:lang w:val="en-PH" w:eastAsia="en-PH"/>
         </w:rPr>
         <w:tab/>
-        <w:t>Purposive sampling is appropriate for this study because the selected respondents are directly engaged in key operational activities such as inventory monitoring, stock management, product recording, and sales transaction processing. Their hands-on experience with the current system enables them to provide accurate, relevant, and reliable information regarding existing procedures, challenges, and system requirements.</w:t>
+      </w:r>
+      <w:r>
+        <w:rPr>
+          <w:sz w:val="24"/>
+          <w:szCs w:val="24"/>
+          <w:lang w:eastAsia="en-PH"/>
+        </w:rPr>
+        <w:t xml:space="preserve">A total of </w:t>
+      </w:r>
+      <w:r>
+        <w:rPr>
+          <w:b/>
+          <w:bCs/>
+          <w:sz w:val="24"/>
+          <w:szCs w:val="24"/>
+          <w:lang w:eastAsia="en-PH"/>
+        </w:rPr>
+        <w:t>three (3) respondents</w:t>
+      </w:r>
+      <w:r>
+        <w:rPr>
+          <w:sz w:val="24"/>
+          <w:szCs w:val="24"/>
+          <w:lang w:eastAsia="en-PH"/>
+        </w:rPr>
+        <w:t xml:space="preserve"> will be selected to participate in the study. </w:t>
+      </w:r>
+      <w:r>
+        <w:rPr>
+          <w:sz w:val="24"/>
+          <w:szCs w:val="24"/>
+          <w:lang w:val="en-PH" w:eastAsia="en-PH"/>
+        </w:rPr>
+        <w:t>The respondents will include individuals who regularly handle inventory records, monitor stock levels, and process sales transactions. They are purposely chosen because of their familiarity with the current workflow, making them capable of providing accurate, reliable, and relevant information needed for the development of the proposed system.</w:t>
       </w:r>
     </w:p>
     <w:p>
@@ -692,7 +671,8 @@
         <w:widowControl/>
         <w:autoSpaceDE/>
         <w:autoSpaceDN/>
-        <w:spacing w:before="100" w:beforeAutospacing="1" w:after="100" w:afterAutospacing="1"/>
+        <w:spacing w:before="100" w:beforeAutospacing="1" w:after="100" w:afterAutospacing="1" w:line="480" w:lineRule="auto"/>
+        <w:ind w:left="850" w:right="567" w:firstLine="284"/>
         <w:jc w:val="both"/>
         <w:rPr>
           <w:sz w:val="24"/>
@@ -707,53 +687,14 @@
           <w:lang w:val="en-PH" w:eastAsia="en-PH"/>
         </w:rPr>
         <w:tab/>
-        <w:t xml:space="preserve">The respondents of this study will consist of </w:t>
-      </w:r>
-      <w:r>
-        <w:rPr>
-          <w:b/>
-          <w:bCs/>
+      </w:r>
+      <w:r>
+        <w:rPr>
           <w:sz w:val="24"/>
           <w:szCs w:val="24"/>
           <w:lang w:val="en-PH" w:eastAsia="en-PH"/>
         </w:rPr>
-        <w:t xml:space="preserve">one (1) store owner, one (1) </w:t>
-      </w:r>
-      <w:r>
-        <w:rPr>
-          <w:b/>
-          <w:bCs/>
-          <w:sz w:val="24"/>
-          <w:szCs w:val="24"/>
-          <w:lang w:val="en-PH" w:eastAsia="en-PH"/>
-        </w:rPr>
-        <w:t>administrator</w:t>
-      </w:r>
-      <w:r>
-        <w:rPr>
-          <w:b/>
-          <w:bCs/>
-          <w:sz w:val="24"/>
-          <w:szCs w:val="24"/>
-          <w:lang w:val="en-PH" w:eastAsia="en-PH"/>
-        </w:rPr>
-        <w:t>, and one (1) authorized staff member</w:t>
-      </w:r>
-      <w:r>
-        <w:rPr>
-          <w:sz w:val="24"/>
-          <w:szCs w:val="24"/>
-          <w:lang w:val="en-PH" w:eastAsia="en-PH"/>
-        </w:rPr>
-        <w:t xml:space="preserve"> of MMB Drug Store. These individuals are considered the primary users and decision-makers in the business. Their roles involve managing inventory records, monitoring stock availability, and processing customer transactions, making them the most appropriate participants for evaluating the proposed system</w:t>
-      </w:r>
-      <w:r>
-        <w:rPr>
-          <w:sz w:val="24"/>
-          <w:szCs w:val="24"/>
-          <w:lang w:val="en-PH" w:eastAsia="en-PH"/>
-        </w:rPr>
-        <w:t>.</w:t>
+        <w:t>The respondents will play a significant role in evaluating the proposed Web-Based Inventory and Point-of-Sale System. Their feedback will be used to assess the system’s performance in terms of functionality, usability, reliability, efficiency, and security. Their responses will also help determine whether the system effectively addresses the existing problems and improves the overall operations of MMB Drug Store.</w:t>
       </w:r>
     </w:p>
     <w:p>
@@ -761,23 +702,36 @@
         <w:widowControl/>
         <w:autoSpaceDE/>
         <w:autoSpaceDN/>
-        <w:spacing w:before="100" w:beforeAutospacing="1" w:after="100" w:afterAutospacing="1"/>
+        <w:spacing w:before="100" w:beforeAutospacing="1" w:after="100" w:afterAutospacing="1" w:line="480" w:lineRule="auto"/>
+        <w:ind w:left="850" w:right="567" w:firstLine="284"/>
+        <w:jc w:val="both"/>
+        <w:rPr>
+          <w:sz w:val="24"/>
+          <w:szCs w:val="24"/>
+          <w:lang w:val="en-PH" w:eastAsia="en-PH"/>
+        </w:rPr>
+      </w:pPr>
+    </w:p>
+    <w:p>
+      <w:pPr>
+        <w:spacing w:after="120" w:line="480" w:lineRule="auto"/>
+        <w:ind w:left="850" w:right="567"/>
         <w:jc w:val="both"/>
         <w:rPr>
           <w:b/>
           <w:bCs/>
-          <w:sz w:val="32"/>
-          <w:szCs w:val="32"/>
+          <w:sz w:val="24"/>
+          <w:szCs w:val="24"/>
         </w:rPr>
       </w:pPr>
       <w:r>
         <w:rPr>
           <w:b/>
           <w:bCs/>
-          <w:sz w:val="32"/>
-          <w:szCs w:val="32"/>
-        </w:rPr>
-        <w:t>Research Instrument</w:t>
+          <w:sz w:val="24"/>
+          <w:szCs w:val="24"/>
+        </w:rPr>
+        <w:t>Sampling Procedure</w:t>
       </w:r>
     </w:p>
     <w:p>
@@ -785,21 +739,30 @@
         <w:widowControl/>
         <w:autoSpaceDE/>
         <w:autoSpaceDN/>
-        <w:spacing w:before="100" w:beforeAutospacing="1" w:after="100" w:afterAutospacing="1"/>
+        <w:spacing w:before="100" w:beforeAutospacing="1" w:after="100" w:afterAutospacing="1" w:line="480" w:lineRule="auto"/>
+        <w:ind w:left="850" w:right="567" w:firstLine="284"/>
         <w:jc w:val="both"/>
         <w:rPr>
           <w:sz w:val="24"/>
           <w:szCs w:val="24"/>
-          <w:lang w:val="en-PH"/>
-        </w:rPr>
-      </w:pPr>
-      <w:r>
-        <w:rPr>
-          <w:sz w:val="24"/>
-          <w:szCs w:val="24"/>
-          <w:lang w:val="en-PH"/>
-        </w:rPr>
-        <w:t xml:space="preserve">The main instrument utilized in this study is a </w:t>
+          <w:lang w:val="en-PH" w:eastAsia="en-PH"/>
+        </w:rPr>
+      </w:pPr>
+      <w:r>
+        <w:rPr>
+          <w:sz w:val="24"/>
+          <w:szCs w:val="24"/>
+          <w:lang w:val="en-PH" w:eastAsia="en-PH"/>
+        </w:rPr>
+        <w:tab/>
+      </w:r>
+      <w:r>
+        <w:rPr>
+          <w:sz w:val="24"/>
+          <w:szCs w:val="24"/>
+          <w:lang w:val="en-PH" w:eastAsia="en-PH"/>
+        </w:rPr>
+        <w:t xml:space="preserve">This study will utilize </w:t>
       </w:r>
       <w:r>
         <w:rPr>
@@ -807,17 +770,17 @@
           <w:bCs/>
           <w:sz w:val="24"/>
           <w:szCs w:val="24"/>
-          <w:lang w:val="en-PH"/>
-        </w:rPr>
-        <w:t>survey questionnaire</w:t>
-      </w:r>
-      <w:r>
-        <w:rPr>
-          <w:sz w:val="24"/>
-          <w:szCs w:val="24"/>
-          <w:lang w:val="en-PH"/>
-        </w:rPr>
-        <w:t xml:space="preserve"> developed to collect relevant information and assess the effectiveness of the proposed Web-Based Inventory and Point-of-Sale </w:t>
+          <w:lang w:val="en-PH" w:eastAsia="en-PH"/>
+        </w:rPr>
+        <w:t>Purposive Sampling</w:t>
+      </w:r>
+      <w:r>
+        <w:rPr>
+          <w:sz w:val="24"/>
+          <w:szCs w:val="24"/>
+          <w:lang w:val="en-PH" w:eastAsia="en-PH"/>
+        </w:rPr>
+        <w:t xml:space="preserve"> in selecting the respondents. This sampling technique involves intentionally choosing participants based on their knowledge, experience, and active involvement in the daily operations of MMB Drug Store. It ensures that only individuals who are directly related to the processes being studied are included as participants.</w:t>
       </w:r>
     </w:p>
     <w:p>
@@ -825,29 +788,23 @@
         <w:widowControl/>
         <w:autoSpaceDE/>
         <w:autoSpaceDN/>
-        <w:spacing w:before="100" w:beforeAutospacing="1" w:after="100" w:afterAutospacing="1"/>
+        <w:spacing w:before="100" w:beforeAutospacing="1" w:after="100" w:afterAutospacing="1" w:line="480" w:lineRule="auto"/>
+        <w:ind w:left="850" w:right="567" w:firstLine="284"/>
         <w:jc w:val="both"/>
         <w:rPr>
           <w:sz w:val="24"/>
           <w:szCs w:val="24"/>
-          <w:lang w:val="en-PH"/>
-        </w:rPr>
-      </w:pPr>
-      <w:r>
-        <w:rPr>
-          <w:sz w:val="24"/>
-          <w:szCs w:val="24"/>
-          <w:lang w:val="en-PH"/>
+          <w:lang w:val="en-PH" w:eastAsia="en-PH"/>
+        </w:rPr>
+      </w:pPr>
+      <w:r>
+        <w:rPr>
+          <w:sz w:val="24"/>
+          <w:szCs w:val="24"/>
+          <w:lang w:val="en-PH" w:eastAsia="en-PH"/>
         </w:rPr>
         <w:tab/>
-      </w:r>
-      <w:r>
-        <w:rPr>
-          <w:sz w:val="24"/>
-          <w:szCs w:val="24"/>
-          <w:lang w:val="en-PH"/>
-        </w:rPr>
-        <w:t>System for MMB Drug Store. The questionnaire will be distributed to selected respondents, including the store owner, administrator, and authorized staff, after they have interacted with the developed system.</w:t>
+        <w:t xml:space="preserve">Purposive sampling is appropriate for this study because the selected respondents are directly engaged in key operational activities such as inventory monitoring, stock management, product recording, and sales transaction processing. Their hands-on experience with the current system </w:t>
       </w:r>
     </w:p>
     <w:p>
@@ -855,58 +812,28 @@
         <w:widowControl/>
         <w:autoSpaceDE/>
         <w:autoSpaceDN/>
-        <w:spacing w:before="100" w:beforeAutospacing="1" w:after="100" w:afterAutospacing="1"/>
+        <w:spacing w:before="100" w:beforeAutospacing="1" w:after="100" w:afterAutospacing="1" w:line="480" w:lineRule="auto"/>
+        <w:ind w:left="850" w:right="567" w:firstLine="284"/>
         <w:jc w:val="both"/>
         <w:rPr>
           <w:sz w:val="24"/>
           <w:szCs w:val="24"/>
-          <w:lang w:val="en-PH"/>
-        </w:rPr>
-      </w:pPr>
-      <w:r>
-        <w:rPr>
-          <w:sz w:val="24"/>
-          <w:szCs w:val="24"/>
-          <w:lang w:val="en-PH"/>
-        </w:rPr>
-        <w:tab/>
-      </w:r>
-      <w:r>
-        <w:rPr>
-          <w:sz w:val="24"/>
-          <w:szCs w:val="24"/>
-          <w:lang w:val="en-PH"/>
-        </w:rPr>
-        <w:t>The questionnaire is divided into two sections. The first section aims to gather information about the current inventory and sales processes, as well as the challenges encountered in managing records manually. The second section is designed to evaluate the proposed system based on specific criteria</w:t>
-      </w:r>
-      <w:r>
-        <w:rPr>
-          <w:sz w:val="24"/>
-          <w:szCs w:val="24"/>
-          <w:lang w:val="en-PH"/>
-        </w:rPr>
-        <w:t xml:space="preserve">. </w:t>
-      </w:r>
-      <w:r>
-        <w:rPr>
-          <w:sz w:val="24"/>
-          <w:szCs w:val="24"/>
-          <w:lang w:val="en-PH"/>
-        </w:rPr>
-        <w:t xml:space="preserve">The questionnaire also includes items that evaluate the effectiveness of barcode generation </w:t>
-      </w:r>
+          <w:lang w:val="en-PH" w:eastAsia="en-PH"/>
+        </w:rPr>
+      </w:pPr>
     </w:p>
     <w:p>
       <w:pPr>
         <w:widowControl/>
         <w:autoSpaceDE/>
         <w:autoSpaceDN/>
-        <w:spacing w:before="100" w:beforeAutospacing="1" w:after="100" w:afterAutospacing="1"/>
+        <w:spacing w:before="100" w:beforeAutospacing="1" w:after="100" w:afterAutospacing="1" w:line="480" w:lineRule="auto"/>
+        <w:ind w:left="850" w:right="567" w:firstLine="284"/>
         <w:jc w:val="both"/>
         <w:rPr>
           <w:sz w:val="24"/>
           <w:szCs w:val="24"/>
-          <w:lang w:val="en-PH"/>
+          <w:lang w:val="en-PH" w:eastAsia="en-PH"/>
         </w:rPr>
       </w:pPr>
     </w:p>
@@ -915,7 +842,282 @@
         <w:widowControl/>
         <w:autoSpaceDE/>
         <w:autoSpaceDN/>
-        <w:spacing w:before="100" w:beforeAutospacing="1" w:after="100" w:afterAutospacing="1"/>
+        <w:spacing w:before="100" w:beforeAutospacing="1" w:after="100" w:afterAutospacing="1" w:line="480" w:lineRule="auto"/>
+        <w:ind w:left="850" w:right="567" w:firstLine="284"/>
+        <w:jc w:val="both"/>
+        <w:rPr>
+          <w:sz w:val="24"/>
+          <w:szCs w:val="24"/>
+          <w:lang w:val="en-PH" w:eastAsia="en-PH"/>
+        </w:rPr>
+      </w:pPr>
+      <w:r>
+        <w:rPr>
+          <w:sz w:val="24"/>
+          <w:szCs w:val="24"/>
+          <w:lang w:val="en-PH" w:eastAsia="en-PH"/>
+        </w:rPr>
+        <w:t>enables them to provide accurate, relevant, and reliable information regarding existing procedures, challenges, and system requirements.</w:t>
+      </w:r>
+    </w:p>
+    <w:p>
+      <w:pPr>
+        <w:widowControl/>
+        <w:autoSpaceDE/>
+        <w:autoSpaceDN/>
+        <w:spacing w:before="100" w:beforeAutospacing="1" w:after="100" w:afterAutospacing="1" w:line="480" w:lineRule="auto"/>
+        <w:ind w:left="850" w:right="567" w:firstLine="284"/>
+        <w:jc w:val="both"/>
+        <w:rPr>
+          <w:sz w:val="24"/>
+          <w:szCs w:val="24"/>
+          <w:lang w:val="en-PH" w:eastAsia="en-PH"/>
+        </w:rPr>
+      </w:pPr>
+      <w:r>
+        <w:rPr>
+          <w:sz w:val="24"/>
+          <w:szCs w:val="24"/>
+          <w:lang w:val="en-PH" w:eastAsia="en-PH"/>
+        </w:rPr>
+        <w:tab/>
+        <w:t xml:space="preserve">The respondents of this study will consist of </w:t>
+      </w:r>
+      <w:r>
+        <w:rPr>
+          <w:b/>
+          <w:bCs/>
+          <w:sz w:val="24"/>
+          <w:szCs w:val="24"/>
+          <w:lang w:val="en-PH" w:eastAsia="en-PH"/>
+        </w:rPr>
+        <w:t xml:space="preserve">one (1) store owner, one (1) </w:t>
+      </w:r>
+      <w:r>
+        <w:rPr>
+          <w:b/>
+          <w:bCs/>
+          <w:sz w:val="24"/>
+          <w:szCs w:val="24"/>
+          <w:lang w:val="en-PH" w:eastAsia="en-PH"/>
+        </w:rPr>
+        <w:t>administrator</w:t>
+      </w:r>
+      <w:r>
+        <w:rPr>
+          <w:b/>
+          <w:bCs/>
+          <w:sz w:val="24"/>
+          <w:szCs w:val="24"/>
+          <w:lang w:val="en-PH" w:eastAsia="en-PH"/>
+        </w:rPr>
+        <w:t>, and one (1) authorized staff member</w:t>
+      </w:r>
+      <w:r>
+        <w:rPr>
+          <w:sz w:val="24"/>
+          <w:szCs w:val="24"/>
+          <w:lang w:val="en-PH" w:eastAsia="en-PH"/>
+        </w:rPr>
+        <w:t xml:space="preserve"> of MMB Drug Store. These individuals are considered the primary users and decision-makers in the business. Their roles involve managing inventory records, monitoring stock availability, and processing customer transactions, making them the most appropriate participants for evaluating the proposed system</w:t>
+      </w:r>
+      <w:r>
+        <w:rPr>
+          <w:sz w:val="24"/>
+          <w:szCs w:val="24"/>
+          <w:lang w:val="en-PH" w:eastAsia="en-PH"/>
+        </w:rPr>
+        <w:t>.</w:t>
+      </w:r>
+    </w:p>
+    <w:p>
+      <w:pPr>
+        <w:widowControl/>
+        <w:autoSpaceDE/>
+        <w:autoSpaceDN/>
+        <w:spacing w:before="100" w:beforeAutospacing="1" w:after="100" w:afterAutospacing="1" w:line="480" w:lineRule="auto"/>
+        <w:ind w:left="850" w:right="567" w:firstLine="284"/>
+        <w:jc w:val="both"/>
+        <w:rPr>
+          <w:sz w:val="24"/>
+          <w:szCs w:val="24"/>
+          <w:lang w:val="en-PH" w:eastAsia="en-PH"/>
+        </w:rPr>
+      </w:pPr>
+    </w:p>
+    <w:p>
+      <w:pPr>
+        <w:widowControl/>
+        <w:autoSpaceDE/>
+        <w:autoSpaceDN/>
+        <w:spacing w:before="100" w:beforeAutospacing="1" w:after="100" w:afterAutospacing="1" w:line="480" w:lineRule="auto"/>
+        <w:ind w:left="850" w:right="567"/>
+        <w:jc w:val="both"/>
+        <w:rPr>
+          <w:b/>
+          <w:bCs/>
+          <w:sz w:val="24"/>
+          <w:szCs w:val="24"/>
+        </w:rPr>
+      </w:pPr>
+      <w:r>
+        <w:rPr>
+          <w:b/>
+          <w:bCs/>
+          <w:sz w:val="24"/>
+          <w:szCs w:val="24"/>
+        </w:rPr>
+        <w:t>Research Instrument</w:t>
+      </w:r>
+    </w:p>
+    <w:p>
+      <w:pPr>
+        <w:widowControl/>
+        <w:autoSpaceDE/>
+        <w:autoSpaceDN/>
+        <w:spacing w:before="100" w:beforeAutospacing="1" w:after="100" w:afterAutospacing="1" w:line="480" w:lineRule="auto"/>
+        <w:ind w:left="850" w:right="567" w:firstLine="284"/>
+        <w:jc w:val="both"/>
+        <w:rPr>
+          <w:sz w:val="24"/>
+          <w:szCs w:val="24"/>
+          <w:lang w:val="en-PH"/>
+        </w:rPr>
+      </w:pPr>
+      <w:r>
+        <w:rPr>
+          <w:sz w:val="24"/>
+          <w:szCs w:val="24"/>
+          <w:lang w:val="en-PH"/>
+        </w:rPr>
+        <w:t xml:space="preserve">The main instrument utilized in this study is a </w:t>
+      </w:r>
+      <w:r>
+        <w:rPr>
+          <w:b/>
+          <w:bCs/>
+          <w:sz w:val="24"/>
+          <w:szCs w:val="24"/>
+          <w:lang w:val="en-PH"/>
+        </w:rPr>
+        <w:t>survey questionnaire</w:t>
+      </w:r>
+      <w:r>
+        <w:rPr>
+          <w:sz w:val="24"/>
+          <w:szCs w:val="24"/>
+          <w:lang w:val="en-PH"/>
+        </w:rPr>
+        <w:t xml:space="preserve"> developed to collect relevant information and assess the effectiveness of the proposed Web-Based Inventory and Point-of-Sale </w:t>
+      </w:r>
+    </w:p>
+    <w:p>
+      <w:pPr>
+        <w:widowControl/>
+        <w:autoSpaceDE/>
+        <w:autoSpaceDN/>
+        <w:spacing w:before="100" w:beforeAutospacing="1" w:after="100" w:afterAutospacing="1" w:line="480" w:lineRule="auto"/>
+        <w:ind w:left="850" w:right="567" w:firstLine="284"/>
+        <w:jc w:val="both"/>
+        <w:rPr>
+          <w:sz w:val="24"/>
+          <w:szCs w:val="24"/>
+          <w:lang w:val="en-PH"/>
+        </w:rPr>
+      </w:pPr>
+      <w:r>
+        <w:rPr>
+          <w:sz w:val="24"/>
+          <w:szCs w:val="24"/>
+          <w:lang w:val="en-PH"/>
+        </w:rPr>
+        <w:tab/>
+      </w:r>
+      <w:r>
+        <w:rPr>
+          <w:sz w:val="24"/>
+          <w:szCs w:val="24"/>
+          <w:lang w:val="en-PH"/>
+        </w:rPr>
+        <w:t>System for MMB Drug Store. The questionnaire will be distributed to selected respondents, including the store owner, administrator, and authorized staff, after they have interacted with the developed system.</w:t>
+      </w:r>
+    </w:p>
+    <w:p>
+      <w:pPr>
+        <w:widowControl/>
+        <w:autoSpaceDE/>
+        <w:autoSpaceDN/>
+        <w:spacing w:before="100" w:beforeAutospacing="1" w:after="100" w:afterAutospacing="1" w:line="480" w:lineRule="auto"/>
+        <w:ind w:left="850" w:right="567" w:firstLine="284"/>
+        <w:jc w:val="both"/>
+        <w:rPr>
+          <w:sz w:val="24"/>
+          <w:szCs w:val="24"/>
+          <w:lang w:val="en-PH"/>
+        </w:rPr>
+      </w:pPr>
+      <w:r>
+        <w:rPr>
+          <w:sz w:val="24"/>
+          <w:szCs w:val="24"/>
+          <w:lang w:val="en-PH"/>
+        </w:rPr>
+        <w:tab/>
+      </w:r>
+      <w:r>
+        <w:rPr>
+          <w:sz w:val="24"/>
+          <w:szCs w:val="24"/>
+          <w:lang w:val="en-PH"/>
+        </w:rPr>
+        <w:t>The questionnaire is divided into two sections. The first section aims to gather information about the current inventory and sales processes, as well as the challenges encountered in managing records manually. The second section is designed to evaluate the proposed system based on specific criteria</w:t>
+      </w:r>
+      <w:r>
+        <w:rPr>
+          <w:sz w:val="24"/>
+          <w:szCs w:val="24"/>
+          <w:lang w:val="en-PH"/>
+        </w:rPr>
+        <w:t xml:space="preserve">. The questionnaire also includes items that evaluate the effectiveness of barcode generation </w:t>
+      </w:r>
+    </w:p>
+    <w:p>
+      <w:pPr>
+        <w:widowControl/>
+        <w:autoSpaceDE/>
+        <w:autoSpaceDN/>
+        <w:spacing w:before="100" w:beforeAutospacing="1" w:after="100" w:afterAutospacing="1" w:line="480" w:lineRule="auto"/>
+        <w:ind w:left="850" w:right="567" w:firstLine="284"/>
+        <w:jc w:val="both"/>
+        <w:rPr>
+          <w:sz w:val="24"/>
+          <w:szCs w:val="24"/>
+          <w:lang w:val="en-PH"/>
+        </w:rPr>
+      </w:pPr>
+    </w:p>
+    <w:p>
+      <w:pPr>
+        <w:widowControl/>
+        <w:autoSpaceDE/>
+        <w:autoSpaceDN/>
+        <w:spacing w:before="100" w:beforeAutospacing="1" w:after="100" w:afterAutospacing="1" w:line="480" w:lineRule="auto"/>
+        <w:ind w:left="850" w:right="567" w:firstLine="284"/>
+        <w:jc w:val="both"/>
+        <w:rPr>
+          <w:sz w:val="24"/>
+          <w:szCs w:val="24"/>
+          <w:lang w:val="en-PH"/>
+        </w:rPr>
+      </w:pPr>
+    </w:p>
+    <w:p>
+      <w:pPr>
+        <w:widowControl/>
+        <w:autoSpaceDE/>
+        <w:autoSpaceDN/>
+        <w:spacing w:before="100" w:beforeAutospacing="1" w:after="100" w:afterAutospacing="1" w:line="480" w:lineRule="auto"/>
+        <w:ind w:left="850" w:right="567" w:firstLine="284"/>
         <w:jc w:val="both"/>
         <w:rPr>
           <w:sz w:val="24"/>
@@ -957,7 +1159,8 @@
         </w:numPr>
         <w:autoSpaceDE/>
         <w:autoSpaceDN/>
-        <w:spacing w:before="100" w:beforeAutospacing="1" w:after="100" w:afterAutospacing="1"/>
+        <w:spacing w:before="100" w:beforeAutospacing="1" w:after="100" w:afterAutospacing="1" w:line="480" w:lineRule="auto"/>
+        <w:ind w:left="850" w:right="567" w:firstLine="284"/>
         <w:jc w:val="both"/>
         <w:rPr>
           <w:sz w:val="24"/>
@@ -983,7 +1186,8 @@
         </w:numPr>
         <w:autoSpaceDE/>
         <w:autoSpaceDN/>
-        <w:spacing w:before="100" w:beforeAutospacing="1" w:after="100" w:afterAutospacing="1"/>
+        <w:spacing w:before="100" w:beforeAutospacing="1" w:after="100" w:afterAutospacing="1" w:line="480" w:lineRule="auto"/>
+        <w:ind w:left="850" w:right="567" w:firstLine="284"/>
         <w:jc w:val="both"/>
         <w:rPr>
           <w:sz w:val="24"/>
@@ -1009,7 +1213,8 @@
         </w:numPr>
         <w:autoSpaceDE/>
         <w:autoSpaceDN/>
-        <w:spacing w:before="100" w:beforeAutospacing="1" w:after="100" w:afterAutospacing="1"/>
+        <w:spacing w:before="100" w:beforeAutospacing="1" w:after="100" w:afterAutospacing="1" w:line="480" w:lineRule="auto"/>
+        <w:ind w:left="850" w:right="567" w:firstLine="284"/>
         <w:jc w:val="both"/>
         <w:rPr>
           <w:sz w:val="24"/>
@@ -1035,7 +1240,8 @@
         </w:numPr>
         <w:autoSpaceDE/>
         <w:autoSpaceDN/>
-        <w:spacing w:before="100" w:beforeAutospacing="1" w:after="100" w:afterAutospacing="1"/>
+        <w:spacing w:before="100" w:beforeAutospacing="1" w:after="100" w:afterAutospacing="1" w:line="480" w:lineRule="auto"/>
+        <w:ind w:left="850" w:right="567" w:firstLine="284"/>
         <w:jc w:val="both"/>
         <w:rPr>
           <w:sz w:val="24"/>
@@ -1061,7 +1267,8 @@
         </w:numPr>
         <w:autoSpaceDE/>
         <w:autoSpaceDN/>
-        <w:spacing w:before="100" w:beforeAutospacing="1" w:after="100" w:afterAutospacing="1"/>
+        <w:spacing w:before="100" w:beforeAutospacing="1" w:after="100" w:afterAutospacing="1" w:line="480" w:lineRule="auto"/>
+        <w:ind w:left="850" w:right="567" w:firstLine="284"/>
         <w:jc w:val="both"/>
         <w:rPr>
           <w:sz w:val="24"/>
@@ -1083,7 +1290,8 @@
         <w:widowControl/>
         <w:autoSpaceDE/>
         <w:autoSpaceDN/>
-        <w:spacing w:before="100" w:beforeAutospacing="1" w:after="100" w:afterAutospacing="1"/>
+        <w:spacing w:before="100" w:beforeAutospacing="1" w:after="100" w:afterAutospacing="1" w:line="480" w:lineRule="auto"/>
+        <w:ind w:left="850" w:right="567" w:firstLine="284"/>
         <w:jc w:val="both"/>
         <w:rPr>
           <w:sz w:val="24"/>
@@ -1124,8 +1332,8 @@
         <w:widowControl/>
         <w:autoSpaceDE/>
         <w:autoSpaceDN/>
-        <w:spacing w:before="100" w:beforeAutospacing="1" w:after="100" w:afterAutospacing="1"/>
-        <w:ind w:left="720"/>
+        <w:spacing w:before="100" w:beforeAutospacing="1" w:after="100" w:afterAutospacing="1" w:line="480" w:lineRule="auto"/>
+        <w:ind w:left="850" w:right="567"/>
         <w:rPr>
           <w:sz w:val="24"/>
           <w:szCs w:val="24"/>
@@ -1173,7 +1381,8 @@
         <w:widowControl/>
         <w:autoSpaceDE/>
         <w:autoSpaceDN/>
-        <w:spacing w:before="100" w:beforeAutospacing="1" w:after="100" w:afterAutospacing="1"/>
+        <w:spacing w:before="100" w:beforeAutospacing="1" w:after="100" w:afterAutospacing="1" w:line="480" w:lineRule="auto"/>
+        <w:ind w:left="850" w:right="567" w:firstLine="284"/>
         <w:jc w:val="both"/>
         <w:rPr>
           <w:sz w:val="24"/>
@@ -1192,67 +1401,270 @@
     </w:p>
     <w:p>
       <w:pPr>
+        <w:widowControl/>
+        <w:autoSpaceDE/>
+        <w:autoSpaceDN/>
+        <w:spacing w:before="100" w:beforeAutospacing="1" w:after="100" w:afterAutospacing="1" w:line="480" w:lineRule="auto"/>
+        <w:ind w:left="850" w:right="567" w:firstLine="284"/>
+        <w:jc w:val="both"/>
+        <w:rPr>
+          <w:sz w:val="24"/>
+          <w:szCs w:val="24"/>
+          <w:lang w:val="en-PH"/>
+        </w:rPr>
+      </w:pPr>
+    </w:p>
+    <w:p>
+      <w:pPr>
+        <w:widowControl/>
+        <w:autoSpaceDE/>
+        <w:autoSpaceDN/>
+        <w:spacing w:before="100" w:beforeAutospacing="1" w:after="100" w:afterAutospacing="1" w:line="480" w:lineRule="auto"/>
+        <w:ind w:left="850" w:right="567" w:firstLine="284"/>
+        <w:jc w:val="both"/>
+        <w:rPr>
+          <w:sz w:val="24"/>
+          <w:szCs w:val="24"/>
+          <w:lang w:val="en-PH"/>
+        </w:rPr>
+      </w:pPr>
+    </w:p>
+    <w:p>
+      <w:pPr>
+        <w:widowControl/>
+        <w:autoSpaceDE/>
+        <w:autoSpaceDN/>
+        <w:spacing w:before="100" w:beforeAutospacing="1" w:after="100" w:afterAutospacing="1" w:line="480" w:lineRule="auto"/>
+        <w:ind w:left="850" w:right="567" w:firstLine="284"/>
+        <w:jc w:val="both"/>
+        <w:rPr>
+          <w:sz w:val="24"/>
+          <w:szCs w:val="24"/>
+          <w:lang w:val="en-PH"/>
+        </w:rPr>
+      </w:pPr>
+    </w:p>
+    <w:p>
+      <w:pPr>
+        <w:widowControl/>
+        <w:autoSpaceDE/>
+        <w:autoSpaceDN/>
+        <w:spacing w:before="100" w:beforeAutospacing="1" w:after="100" w:afterAutospacing="1" w:line="480" w:lineRule="auto"/>
+        <w:ind w:left="850" w:right="567" w:firstLine="284"/>
+        <w:jc w:val="both"/>
+        <w:rPr>
+          <w:sz w:val="24"/>
+          <w:szCs w:val="24"/>
+          <w:lang w:val="en-PH"/>
+        </w:rPr>
+      </w:pPr>
+    </w:p>
+    <w:p>
+      <w:pPr>
+        <w:spacing w:line="480" w:lineRule="auto"/>
+        <w:ind w:left="850" w:right="567"/>
         <w:rPr>
           <w:b/>
           <w:bCs/>
-          <w:sz w:val="40"/>
-          <w:szCs w:val="40"/>
+          <w:sz w:val="24"/>
+          <w:szCs w:val="24"/>
         </w:rPr>
       </w:pPr>
       <w:r>
         <w:rPr>
           <w:b/>
           <w:bCs/>
-          <w:sz w:val="40"/>
-          <w:szCs w:val="40"/>
+          <w:sz w:val="24"/>
+          <w:szCs w:val="24"/>
         </w:rPr>
         <w:t>Data Gathering Procedure</w:t>
       </w:r>
+    </w:p>
+    <w:p>
+      <w:pPr>
+        <w:spacing w:line="480" w:lineRule="auto"/>
+        <w:ind w:left="850" w:right="567" w:firstLine="284"/>
+        <w:rPr>
+          <w:sz w:val="24"/>
+          <w:szCs w:val="24"/>
+        </w:rPr>
+      </w:pPr>
+      <w:r>
+        <w:rPr>
+          <w:sz w:val="24"/>
+          <w:szCs w:val="24"/>
+        </w:rPr>
+        <w:t>The researchers followed a systematic and organized procedure in collecting the necessary data for the study to ensure accuracy and reliability.</w:t>
+      </w:r>
+    </w:p>
+    <w:p>
+      <w:pPr>
+        <w:spacing w:line="480" w:lineRule="auto"/>
+        <w:ind w:left="850" w:right="567" w:firstLine="284"/>
+        <w:jc w:val="both"/>
+        <w:rPr>
+          <w:sz w:val="24"/>
+          <w:szCs w:val="24"/>
+        </w:rPr>
+      </w:pPr>
+      <w:r>
+        <w:rPr>
+          <w:sz w:val="24"/>
+          <w:szCs w:val="24"/>
+        </w:rPr>
+        <w:tab/>
+        <w:t>First, a formal letter requesting permission to conduct the study was prepared and submitted to MMB Drug Store. The purpose, objectives, and scope of the study were clearly explained to the store owner, particularly the development of a Web-Based Inventory and Point-of-Sale System. Upon approval, the researchers coordinated with the store owner and authorized staff to schedule the data gathering activities.</w:t>
+      </w:r>
+    </w:p>
+    <w:p>
+      <w:pPr>
+        <w:spacing w:line="480" w:lineRule="auto"/>
+        <w:ind w:left="850" w:right="567" w:firstLine="284"/>
+        <w:jc w:val="both"/>
+        <w:rPr>
+          <w:sz w:val="24"/>
+          <w:szCs w:val="24"/>
+        </w:rPr>
+      </w:pPr>
+      <w:r>
+        <w:rPr>
+          <w:sz w:val="24"/>
+          <w:szCs w:val="24"/>
+        </w:rPr>
+        <w:t>Second, the researchers prepared and validated the survey questionnaire to ensure that the questions were clear, relevant, and aligned with the objectives of the study. The questionnaire was designed to gather information about the current inventory and sales processes, as well as the challenges encountered by the store.</w:t>
+      </w:r>
+    </w:p>
+    <w:p>
+      <w:pPr>
+        <w:spacing w:line="480" w:lineRule="auto"/>
+        <w:ind w:left="850" w:right="567" w:firstLine="284"/>
+        <w:jc w:val="both"/>
+        <w:rPr>
+          <w:sz w:val="24"/>
+          <w:szCs w:val="24"/>
+        </w:rPr>
+      </w:pPr>
+      <w:r>
+        <w:rPr>
+          <w:sz w:val="24"/>
+          <w:szCs w:val="24"/>
+        </w:rPr>
+        <w:t>Third, the survey questionnaire was distributed to the selected respondents, including the store owner, administrator, and authorized staff of MMB Drug Store. The respondents were given sufficient time to answer the questionnaire and provide accurate responses based on their actual experience with the current system.</w:t>
+      </w:r>
+    </w:p>
+    <w:p>
+      <w:pPr>
+        <w:spacing w:line="480" w:lineRule="auto"/>
+        <w:ind w:left="850" w:right="567" w:firstLine="284"/>
+        <w:jc w:val="both"/>
+        <w:rPr>
+          <w:sz w:val="24"/>
+          <w:szCs w:val="24"/>
+        </w:rPr>
+      </w:pPr>
+      <w:r>
+        <w:rPr>
+          <w:sz w:val="24"/>
+          <w:szCs w:val="24"/>
+        </w:rPr>
+        <w:t>Fourth, based on the responses gathered from the questionnaire, the researchers analyzed the data and identified the system requirements. These findings served as the basis for designing and developing the proposed Web-Based Inventory and Point-of-Sale System for MMB Drug Store.</w:t>
+      </w:r>
+      <w:r>
+        <w:rPr>
+          <w:sz w:val="24"/>
+          <w:szCs w:val="24"/>
+        </w:rPr>
+        <w:tab/>
+      </w:r>
+    </w:p>
+    <w:p>
+      <w:pPr>
+        <w:spacing w:line="480" w:lineRule="auto"/>
+        <w:ind w:left="850" w:right="567" w:firstLine="284"/>
+        <w:jc w:val="both"/>
+        <w:rPr>
+          <w:sz w:val="24"/>
+          <w:szCs w:val="24"/>
+          <w:lang w:val="en-PH"/>
+        </w:rPr>
+      </w:pPr>
+      <w:r>
+        <w:rPr>
+          <w:sz w:val="24"/>
+          <w:szCs w:val="24"/>
+        </w:rPr>
+        <w:tab/>
+        <w:t xml:space="preserve">Finally, after the system was fully developed, the same respondents were asked to evaluate the system using the survey questionnaire. The respondents were given time to use and assess the system before answering the evaluation. Their responses were then collected, organized, and prepared for data analysis to determine the effectiveness, usability, and overall performance of the </w:t>
+      </w:r>
+      <w:r>
+        <w:rPr>
+          <w:sz w:val="24"/>
+          <w:szCs w:val="24"/>
+        </w:rPr>
+        <w:lastRenderedPageBreak/>
+        <w:t>system.</w:t>
+      </w:r>
+    </w:p>
+    <w:p>
+      <w:pPr>
+        <w:spacing w:line="480" w:lineRule="auto"/>
+        <w:ind w:left="850" w:right="567" w:firstLine="284"/>
+        <w:jc w:val="both"/>
+        <w:rPr>
+          <w:sz w:val="24"/>
+          <w:szCs w:val="24"/>
+          <w:lang w:val="en-PH"/>
+        </w:rPr>
+      </w:pPr>
+    </w:p>
+    <w:p>
+      <w:pPr>
+        <w:spacing w:line="480" w:lineRule="auto"/>
+        <w:ind w:left="850" w:right="567" w:firstLine="284"/>
+        <w:jc w:val="both"/>
+        <w:rPr>
+          <w:sz w:val="24"/>
+          <w:szCs w:val="24"/>
+          <w:lang w:val="en-PH"/>
+        </w:rPr>
+      </w:pPr>
+    </w:p>
+    <w:p>
+      <w:pPr>
+        <w:spacing w:line="480" w:lineRule="auto"/>
+        <w:ind w:left="850" w:right="567"/>
+        <w:rPr>
+          <w:sz w:val="24"/>
+          <w:szCs w:val="24"/>
+          <w:lang w:val="en-PH"/>
+        </w:rPr>
+      </w:pPr>
       <w:r>
         <w:rPr>
           <w:b/>
           <w:bCs/>
-          <w:sz w:val="40"/>
-          <w:szCs w:val="40"/>
-        </w:rPr>
-        <w:br/>
-      </w:r>
-    </w:p>
-    <w:p>
-      <w:pPr>
-        <w:rPr>
-          <w:sz w:val="24"/>
-          <w:szCs w:val="24"/>
-        </w:rPr>
-      </w:pPr>
-      <w:r>
-        <w:rPr>
-          <w:sz w:val="24"/>
-          <w:szCs w:val="24"/>
-        </w:rPr>
-        <w:t>The researchers followed a systematic and organized procedure in collecting the necessary data for the study to ensure accuracy and reliability.</w:t>
-      </w:r>
-    </w:p>
-    <w:p>
-      <w:pPr>
-        <w:rPr>
-          <w:sz w:val="24"/>
-          <w:szCs w:val="24"/>
-        </w:rPr>
-      </w:pPr>
-    </w:p>
-    <w:p>
-      <w:pPr>
+          <w:sz w:val="24"/>
+          <w:szCs w:val="24"/>
+        </w:rPr>
+        <w:t>Data Analysis</w:t>
+      </w:r>
+    </w:p>
+    <w:p>
+      <w:pPr>
+        <w:spacing w:line="480" w:lineRule="auto"/>
+        <w:ind w:left="850" w:right="567" w:firstLine="284"/>
         <w:jc w:val="both"/>
         <w:rPr>
           <w:sz w:val="24"/>
           <w:szCs w:val="24"/>
-        </w:rPr>
-      </w:pPr>
-      <w:r>
-        <w:rPr>
-          <w:sz w:val="24"/>
-          <w:szCs w:val="24"/>
+          <w:lang w:val="en-PH"/>
+        </w:rPr>
+      </w:pPr>
+      <w:r>
+        <w:rPr>
+          <w:sz w:val="24"/>
+          <w:szCs w:val="24"/>
+          <w:lang w:val="en-PH"/>
         </w:rPr>
         <w:tab/>
       </w:r>
@@ -1260,207 +1672,33 @@
         <w:rPr>
           <w:sz w:val="24"/>
           <w:szCs w:val="24"/>
-        </w:rPr>
-        <w:t>First, a formal letter requesting permission to conduct the study was prepared and submitted to MMB Drug Store. The purpose, objectives, and scope of the study were clearly explained to the store owner, particularly the development of a Web-Based Inventory and Point-of-Sale System. Upon approval, the researchers coordinated with the store owner and authorized staff to schedule the data gathering activities.</w:t>
-      </w:r>
-    </w:p>
-    <w:p>
-      <w:pPr>
-        <w:jc w:val="both"/>
-        <w:rPr>
-          <w:sz w:val="24"/>
-          <w:szCs w:val="24"/>
-        </w:rPr>
-      </w:pPr>
-    </w:p>
-    <w:p>
-      <w:pPr>
-        <w:jc w:val="both"/>
-        <w:rPr>
-          <w:sz w:val="24"/>
-          <w:szCs w:val="24"/>
-        </w:rPr>
-      </w:pPr>
-      <w:r>
-        <w:rPr>
-          <w:sz w:val="24"/>
-          <w:szCs w:val="24"/>
-        </w:rPr>
-        <w:tab/>
-      </w:r>
-      <w:r>
-        <w:rPr>
-          <w:sz w:val="24"/>
-          <w:szCs w:val="24"/>
-        </w:rPr>
-        <w:t xml:space="preserve">Second, the researchers prepared and validated the survey questionnaire to ensure that the questions were clear, relevant, and aligned with the objectives of the study. The questionnaire was designed to gather information about the current inventory and sales processes, as well as the </w:t>
-      </w:r>
-    </w:p>
-    <w:p>
-      <w:pPr>
-        <w:jc w:val="both"/>
-        <w:rPr>
-          <w:sz w:val="24"/>
-          <w:szCs w:val="24"/>
-        </w:rPr>
-      </w:pPr>
-      <w:r>
-        <w:rPr>
-          <w:sz w:val="24"/>
-          <w:szCs w:val="24"/>
-        </w:rPr>
-        <w:t>challenges encountered by the store.</w:t>
-      </w:r>
-    </w:p>
-    <w:p>
-      <w:pPr>
-        <w:jc w:val="both"/>
-        <w:rPr>
-          <w:sz w:val="24"/>
-          <w:szCs w:val="24"/>
-        </w:rPr>
-      </w:pPr>
-    </w:p>
-    <w:p>
-      <w:pPr>
-        <w:jc w:val="both"/>
-        <w:rPr>
-          <w:sz w:val="24"/>
-          <w:szCs w:val="24"/>
-        </w:rPr>
-      </w:pPr>
-      <w:r>
-        <w:rPr>
-          <w:sz w:val="24"/>
-          <w:szCs w:val="24"/>
-        </w:rPr>
-        <w:tab/>
-      </w:r>
-      <w:r>
-        <w:rPr>
-          <w:sz w:val="24"/>
-          <w:szCs w:val="24"/>
-        </w:rPr>
-        <w:t>Third, the survey questionnaire was distributed to the selected respondents, including the store owner, administrator, and authorized staff of MMB Drug Store. The respondents were given sufficient time to answer the questionnaire and provide accurate responses based on their actual experience with the current system.</w:t>
-      </w:r>
-    </w:p>
-    <w:p>
-      <w:pPr>
-        <w:rPr>
-          <w:sz w:val="24"/>
-          <w:szCs w:val="24"/>
-        </w:rPr>
-      </w:pPr>
-    </w:p>
-    <w:p>
-      <w:pPr>
-        <w:rPr>
-          <w:sz w:val="24"/>
-          <w:szCs w:val="24"/>
-        </w:rPr>
-      </w:pPr>
-      <w:r>
-        <w:rPr>
-          <w:sz w:val="24"/>
-          <w:szCs w:val="24"/>
-        </w:rPr>
-        <w:tab/>
-      </w:r>
-    </w:p>
-    <w:p>
-      <w:pPr>
-        <w:rPr>
-          <w:sz w:val="24"/>
-          <w:szCs w:val="24"/>
-        </w:rPr>
-      </w:pPr>
-    </w:p>
-    <w:p>
-      <w:pPr>
-        <w:rPr>
-          <w:sz w:val="24"/>
-          <w:szCs w:val="24"/>
-        </w:rPr>
-      </w:pPr>
-    </w:p>
-    <w:p>
-      <w:pPr>
-        <w:jc w:val="both"/>
-        <w:rPr>
-          <w:sz w:val="24"/>
-          <w:szCs w:val="24"/>
-        </w:rPr>
-      </w:pPr>
-      <w:r>
-        <w:rPr>
-          <w:sz w:val="24"/>
-          <w:szCs w:val="24"/>
-        </w:rPr>
-        <w:t>Fourth, based on the responses gathered from the questionnaire, the researchers analyzed the data and identified the system requirements. These findings served as the basis for designing and developing the proposed Web-Based Inventory and Point-of-Sale System for MMB Drug Store.</w:t>
-      </w:r>
-    </w:p>
-    <w:p>
-      <w:pPr>
-        <w:jc w:val="both"/>
-        <w:rPr>
-          <w:sz w:val="24"/>
-          <w:szCs w:val="24"/>
-        </w:rPr>
-      </w:pPr>
-    </w:p>
-    <w:p>
-      <w:pPr>
-        <w:jc w:val="both"/>
-        <w:rPr>
-          <w:sz w:val="24"/>
-          <w:szCs w:val="24"/>
-          <w:lang w:val="en-PH"/>
-        </w:rPr>
-      </w:pPr>
-      <w:r>
-        <w:rPr>
-          <w:sz w:val="24"/>
-          <w:szCs w:val="24"/>
-        </w:rPr>
-        <w:tab/>
-      </w:r>
-      <w:r>
-        <w:rPr>
-          <w:sz w:val="24"/>
-          <w:szCs w:val="24"/>
-        </w:rPr>
-        <w:t>Finally, after the system was fully developed, the same respondents were asked to evaluate the system using the survey questionnaire. The respondents were given time to use and assess the system before answering the evaluation. Their responses were then collected, organized, and prepared for data analysis to determine the effectiveness, usability, and overall performance of the system.</w:t>
-      </w:r>
-    </w:p>
-    <w:p>
-      <w:pPr>
-        <w:rPr>
-          <w:sz w:val="24"/>
-          <w:szCs w:val="24"/>
-          <w:lang w:val="en-PH"/>
-        </w:rPr>
-      </w:pPr>
-    </w:p>
-    <w:p>
-      <w:pPr>
-        <w:rPr>
-          <w:sz w:val="24"/>
-          <w:szCs w:val="24"/>
-          <w:lang w:val="en-PH"/>
-        </w:rPr>
-      </w:pPr>
+          <w:lang w:val="en-PH"/>
+        </w:rPr>
+        <w:t xml:space="preserve">The data collected in this study will be analyzed using </w:t>
+      </w:r>
       <w:r>
         <w:rPr>
           <w:b/>
           <w:bCs/>
-          <w:sz w:val="40"/>
-          <w:szCs w:val="40"/>
-        </w:rPr>
-        <w:t>Data Analysis</w:t>
-      </w:r>
-    </w:p>
-    <w:p>
-      <w:pPr>
+          <w:sz w:val="24"/>
+          <w:szCs w:val="24"/>
+          <w:lang w:val="en-PH"/>
+        </w:rPr>
+        <w:t>descriptive statistical methods</w:t>
+      </w:r>
+      <w:r>
+        <w:rPr>
+          <w:sz w:val="24"/>
+          <w:szCs w:val="24"/>
+          <w:lang w:val="en-PH"/>
+        </w:rPr>
+        <w:t>. Frequency and percentage will be used to summarize the responses related to the current inventory and sales processes of MMB Drug Store.</w:t>
+      </w:r>
+    </w:p>
+    <w:p>
+      <w:pPr>
+        <w:spacing w:line="480" w:lineRule="auto"/>
+        <w:ind w:left="850" w:right="567" w:firstLine="284"/>
         <w:jc w:val="both"/>
         <w:rPr>
           <w:sz w:val="24"/>
@@ -1468,31 +1706,13 @@
           <w:lang w:val="en-PH"/>
         </w:rPr>
       </w:pPr>
-    </w:p>
-    <w:p>
-      <w:pPr>
-        <w:jc w:val="both"/>
-        <w:rPr>
-          <w:sz w:val="24"/>
-          <w:szCs w:val="24"/>
-          <w:lang w:val="en-PH"/>
-        </w:rPr>
-      </w:pPr>
-      <w:r>
-        <w:rPr>
-          <w:sz w:val="24"/>
-          <w:szCs w:val="24"/>
-          <w:lang w:val="en-PH"/>
-        </w:rPr>
-        <w:tab/>
-      </w:r>
-      <w:r>
-        <w:rPr>
-          <w:sz w:val="24"/>
-          <w:szCs w:val="24"/>
-          <w:lang w:val="en-PH"/>
-        </w:rPr>
-        <w:t xml:space="preserve">The data collected in this study will be analyzed using </w:t>
+      <w:r>
+        <w:rPr>
+          <w:sz w:val="24"/>
+          <w:szCs w:val="24"/>
+          <w:lang w:val="en-PH"/>
+        </w:rPr>
+        <w:t xml:space="preserve">To evaluate the effectiveness of the proposed Web-Based Inventory and Point-of-Sale System, the </w:t>
       </w:r>
       <w:r>
         <w:rPr>
@@ -1502,60 +1722,6 @@
           <w:szCs w:val="24"/>
           <w:lang w:val="en-PH"/>
         </w:rPr>
-        <w:t>descriptive statistical methods</w:t>
-      </w:r>
-      <w:r>
-        <w:rPr>
-          <w:sz w:val="24"/>
-          <w:szCs w:val="24"/>
-          <w:lang w:val="en-PH"/>
-        </w:rPr>
-        <w:t>. Frequency and percentage will be used to summarize the responses related to the current inventory and sales processes of MMB Drug Store.</w:t>
-      </w:r>
-    </w:p>
-    <w:p>
-      <w:pPr>
-        <w:jc w:val="both"/>
-        <w:rPr>
-          <w:sz w:val="24"/>
-          <w:szCs w:val="24"/>
-          <w:lang w:val="en-PH"/>
-        </w:rPr>
-      </w:pPr>
-    </w:p>
-    <w:p>
-      <w:pPr>
-        <w:jc w:val="both"/>
-        <w:rPr>
-          <w:sz w:val="24"/>
-          <w:szCs w:val="24"/>
-          <w:lang w:val="en-PH"/>
-        </w:rPr>
-      </w:pPr>
-      <w:r>
-        <w:rPr>
-          <w:sz w:val="24"/>
-          <w:szCs w:val="24"/>
-          <w:lang w:val="en-PH"/>
-        </w:rPr>
-        <w:tab/>
-      </w:r>
-      <w:r>
-        <w:rPr>
-          <w:sz w:val="24"/>
-          <w:szCs w:val="24"/>
-          <w:lang w:val="en-PH"/>
-        </w:rPr>
-        <w:t xml:space="preserve">To evaluate the effectiveness of the proposed Web-Based Inventory and Point-of-Sale System, the </w:t>
-      </w:r>
-      <w:r>
-        <w:rPr>
-          <w:b/>
-          <w:bCs/>
-          <w:sz w:val="24"/>
-          <w:szCs w:val="24"/>
-          <w:lang w:val="en-PH"/>
-        </w:rPr>
         <w:t>weighted mean</w:t>
       </w:r>
       <w:r>
@@ -1566,15 +1732,6 @@
         </w:rPr>
         <w:t xml:space="preserve"> will be used based on the responses gathered from the survey questionnaire. The evaluation will focus on the following criteria:</w:t>
       </w:r>
-    </w:p>
-    <w:p>
-      <w:pPr>
-        <w:rPr>
-          <w:sz w:val="24"/>
-          <w:szCs w:val="24"/>
-          <w:lang w:val="en-PH"/>
-        </w:rPr>
-      </w:pPr>
     </w:p>
     <w:p>
       <w:pPr>
@@ -1582,6 +1739,8 @@
           <w:ilvl w:val="0"/>
           <w:numId w:val="38"/>
         </w:numPr>
+        <w:spacing w:line="480" w:lineRule="auto"/>
+        <w:ind w:left="850" w:right="567" w:firstLine="284"/>
         <w:rPr>
           <w:sz w:val="24"/>
           <w:szCs w:val="24"/>
@@ -1603,6 +1762,8 @@
           <w:ilvl w:val="0"/>
           <w:numId w:val="38"/>
         </w:numPr>
+        <w:spacing w:line="480" w:lineRule="auto"/>
+        <w:ind w:left="850" w:right="567" w:firstLine="284"/>
         <w:rPr>
           <w:sz w:val="24"/>
           <w:szCs w:val="24"/>
@@ -1624,6 +1785,8 @@
           <w:ilvl w:val="0"/>
           <w:numId w:val="38"/>
         </w:numPr>
+        <w:spacing w:line="480" w:lineRule="auto"/>
+        <w:ind w:left="850" w:right="567" w:firstLine="284"/>
         <w:rPr>
           <w:sz w:val="24"/>
           <w:szCs w:val="24"/>
@@ -1645,6 +1808,8 @@
           <w:ilvl w:val="0"/>
           <w:numId w:val="38"/>
         </w:numPr>
+        <w:spacing w:line="480" w:lineRule="auto"/>
+        <w:ind w:left="850" w:right="567" w:firstLine="284"/>
         <w:rPr>
           <w:sz w:val="24"/>
           <w:szCs w:val="24"/>
@@ -1666,6 +1831,8 @@
           <w:ilvl w:val="0"/>
           <w:numId w:val="38"/>
         </w:numPr>
+        <w:spacing w:line="480" w:lineRule="auto"/>
+        <w:ind w:left="850" w:right="567" w:firstLine="284"/>
         <w:rPr>
           <w:sz w:val="24"/>
           <w:szCs w:val="24"/>
@@ -1683,16 +1850,19 @@
     </w:p>
     <w:p>
       <w:pPr>
-        <w:ind w:left="720"/>
-        <w:rPr>
-          <w:sz w:val="24"/>
-          <w:szCs w:val="24"/>
-          <w:lang w:val="en-PH"/>
-        </w:rPr>
-      </w:pPr>
-    </w:p>
-    <w:p>
-      <w:pPr>
+        <w:spacing w:line="480" w:lineRule="auto"/>
+        <w:ind w:left="850" w:right="567"/>
+        <w:rPr>
+          <w:sz w:val="24"/>
+          <w:szCs w:val="24"/>
+          <w:lang w:val="en-PH"/>
+        </w:rPr>
+      </w:pPr>
+    </w:p>
+    <w:p>
+      <w:pPr>
+        <w:spacing w:line="480" w:lineRule="auto"/>
+        <w:ind w:left="850" w:right="567" w:firstLine="284"/>
         <w:jc w:val="both"/>
         <w:rPr>
           <w:sz w:val="24"/>
@@ -1737,15 +1907,8 @@
     </w:p>
     <w:p>
       <w:pPr>
-        <w:rPr>
-          <w:sz w:val="24"/>
-          <w:szCs w:val="24"/>
-          <w:lang w:val="en-PH"/>
-        </w:rPr>
-      </w:pPr>
-    </w:p>
-    <w:p>
-      <w:pPr>
+        <w:spacing w:line="480" w:lineRule="auto"/>
+        <w:ind w:left="850" w:right="567" w:firstLine="284"/>
         <w:rPr>
           <w:sz w:val="24"/>
           <w:szCs w:val="24"/>
@@ -1763,16 +1926,8 @@
     </w:p>
     <w:p>
       <w:pPr>
-        <w:rPr>
-          <w:sz w:val="24"/>
-          <w:szCs w:val="24"/>
-          <w:lang w:val="en-PH"/>
-        </w:rPr>
-      </w:pPr>
-    </w:p>
-    <w:p>
-      <w:pPr>
-        <w:ind w:left="360"/>
+        <w:spacing w:line="480" w:lineRule="auto"/>
+        <w:ind w:left="850" w:right="567"/>
         <w:rPr>
           <w:sz w:val="24"/>
           <w:szCs w:val="24"/>
@@ -1817,15 +1972,52 @@
     </w:p>
     <w:p>
       <w:pPr>
-        <w:rPr>
-          <w:sz w:val="24"/>
-          <w:szCs w:val="24"/>
-          <w:lang w:val="en-PH"/>
-        </w:rPr>
-      </w:pPr>
-    </w:p>
-    <w:p>
-      <w:pPr>
+        <w:spacing w:line="480" w:lineRule="auto"/>
+        <w:ind w:left="850" w:right="567"/>
+        <w:rPr>
+          <w:sz w:val="24"/>
+          <w:szCs w:val="24"/>
+          <w:lang w:val="en-PH"/>
+        </w:rPr>
+      </w:pPr>
+    </w:p>
+    <w:p>
+      <w:pPr>
+        <w:spacing w:line="480" w:lineRule="auto"/>
+        <w:ind w:left="850" w:right="567"/>
+        <w:rPr>
+          <w:sz w:val="24"/>
+          <w:szCs w:val="24"/>
+          <w:lang w:val="en-PH"/>
+        </w:rPr>
+      </w:pPr>
+    </w:p>
+    <w:p>
+      <w:pPr>
+        <w:spacing w:line="480" w:lineRule="auto"/>
+        <w:ind w:left="850" w:right="567"/>
+        <w:rPr>
+          <w:sz w:val="24"/>
+          <w:szCs w:val="24"/>
+          <w:lang w:val="en-PH"/>
+        </w:rPr>
+      </w:pPr>
+    </w:p>
+    <w:p>
+      <w:pPr>
+        <w:spacing w:line="480" w:lineRule="auto"/>
+        <w:ind w:left="850" w:right="567"/>
+        <w:rPr>
+          <w:sz w:val="24"/>
+          <w:szCs w:val="24"/>
+          <w:lang w:val="en-PH"/>
+        </w:rPr>
+      </w:pPr>
+    </w:p>
+    <w:p>
+      <w:pPr>
+        <w:spacing w:line="480" w:lineRule="auto"/>
+        <w:ind w:left="850" w:right="567"/>
         <w:rPr>
           <w:sz w:val="24"/>
           <w:szCs w:val="24"/>
@@ -1836,24 +2028,22 @@
     <w:tbl>
       <w:tblPr>
         <w:tblStyle w:val="TableGrid"/>
-        <w:tblW w:w="9579" w:type="dxa"/>
+        <w:tblW w:w="10768" w:type="dxa"/>
         <w:tblLook w:val="04A0" w:firstRow="1" w:lastRow="0" w:firstColumn="1" w:lastColumn="0" w:noHBand="0" w:noVBand="1"/>
       </w:tblPr>
       <w:tblGrid>
-        <w:gridCol w:w="4673"/>
-        <w:gridCol w:w="4684"/>
-        <w:gridCol w:w="222"/>
+        <w:gridCol w:w="5382"/>
+        <w:gridCol w:w="5386"/>
       </w:tblGrid>
       <w:tr>
-        <w:trPr>
-          <w:gridAfter w:val="1"/>
-        </w:trPr>
         <w:tc>
           <w:tcPr>
-            <w:tcW w:w="4749" w:type="dxa"/>
+            <w:tcW w:w="5382" w:type="dxa"/>
           </w:tcPr>
           <w:p>
             <w:pPr>
+              <w:spacing w:line="480" w:lineRule="auto"/>
+              <w:ind w:left="850" w:right="567" w:firstLine="284"/>
               <w:jc w:val="center"/>
               <w:rPr>
                 <w:sz w:val="24"/>
@@ -1875,11 +2065,13 @@
         </w:tc>
         <w:tc>
           <w:tcPr>
-            <w:tcW w:w="4749" w:type="dxa"/>
+            <w:tcW w:w="5386" w:type="dxa"/>
             <w:vAlign w:val="center"/>
           </w:tcPr>
           <w:p>
             <w:pPr>
+              <w:spacing w:line="480" w:lineRule="auto"/>
+              <w:ind w:left="850" w:right="567" w:firstLine="284"/>
               <w:jc w:val="center"/>
               <w:rPr>
                 <w:sz w:val="24"/>
@@ -1901,15 +2093,14 @@
         </w:tc>
       </w:tr>
       <w:tr>
-        <w:trPr>
-          <w:gridAfter w:val="1"/>
-        </w:trPr>
         <w:tc>
           <w:tcPr>
-            <w:tcW w:w="4749" w:type="dxa"/>
+            <w:tcW w:w="5382" w:type="dxa"/>
           </w:tcPr>
           <w:p>
             <w:pPr>
+              <w:spacing w:line="480" w:lineRule="auto"/>
+              <w:ind w:left="850" w:right="567" w:firstLine="284"/>
               <w:jc w:val="center"/>
               <w:rPr>
                 <w:sz w:val="24"/>
@@ -1929,10 +2120,12 @@
         </w:tc>
         <w:tc>
           <w:tcPr>
-            <w:tcW w:w="4749" w:type="dxa"/>
+            <w:tcW w:w="5386" w:type="dxa"/>
           </w:tcPr>
           <w:p>
             <w:pPr>
+              <w:spacing w:line="480" w:lineRule="auto"/>
+              <w:ind w:left="850" w:right="567" w:firstLine="284"/>
               <w:jc w:val="center"/>
               <w:rPr>
                 <w:sz w:val="24"/>
@@ -1952,15 +2145,14 @@
         </w:tc>
       </w:tr>
       <w:tr>
-        <w:trPr>
-          <w:gridAfter w:val="1"/>
-        </w:trPr>
         <w:tc>
           <w:tcPr>
-            <w:tcW w:w="4749" w:type="dxa"/>
+            <w:tcW w:w="5382" w:type="dxa"/>
           </w:tcPr>
           <w:p>
             <w:pPr>
+              <w:spacing w:line="480" w:lineRule="auto"/>
+              <w:ind w:left="850" w:right="567" w:firstLine="284"/>
               <w:jc w:val="center"/>
               <w:rPr>
                 <w:sz w:val="24"/>
@@ -1980,11 +2172,13 @@
         </w:tc>
         <w:tc>
           <w:tcPr>
-            <w:tcW w:w="4749" w:type="dxa"/>
+            <w:tcW w:w="5386" w:type="dxa"/>
             <w:vAlign w:val="center"/>
           </w:tcPr>
           <w:p>
             <w:pPr>
+              <w:spacing w:line="480" w:lineRule="auto"/>
+              <w:ind w:left="850" w:right="567" w:firstLine="284"/>
               <w:jc w:val="center"/>
               <w:rPr>
                 <w:sz w:val="24"/>
@@ -2004,15 +2198,14 @@
         </w:tc>
       </w:tr>
       <w:tr>
-        <w:trPr>
-          <w:gridAfter w:val="1"/>
-        </w:trPr>
         <w:tc>
           <w:tcPr>
-            <w:tcW w:w="4749" w:type="dxa"/>
+            <w:tcW w:w="5382" w:type="dxa"/>
           </w:tcPr>
           <w:p>
             <w:pPr>
+              <w:spacing w:line="480" w:lineRule="auto"/>
+              <w:ind w:left="850" w:right="567" w:firstLine="284"/>
               <w:jc w:val="center"/>
               <w:rPr>
                 <w:sz w:val="24"/>
@@ -2032,10 +2225,12 @@
         </w:tc>
         <w:tc>
           <w:tcPr>
-            <w:tcW w:w="4749" w:type="dxa"/>
+            <w:tcW w:w="5386" w:type="dxa"/>
           </w:tcPr>
           <w:p>
             <w:pPr>
+              <w:spacing w:line="480" w:lineRule="auto"/>
+              <w:ind w:left="850" w:right="567" w:firstLine="284"/>
               <w:jc w:val="center"/>
               <w:rPr>
                 <w:sz w:val="24"/>
@@ -2057,10 +2252,12 @@
       <w:tr>
         <w:tc>
           <w:tcPr>
-            <w:tcW w:w="4749" w:type="dxa"/>
+            <w:tcW w:w="5382" w:type="dxa"/>
           </w:tcPr>
           <w:p>
             <w:pPr>
+              <w:spacing w:line="480" w:lineRule="auto"/>
+              <w:ind w:left="850" w:right="567" w:firstLine="284"/>
               <w:jc w:val="center"/>
               <w:rPr>
                 <w:sz w:val="24"/>
@@ -2080,11 +2277,13 @@
         </w:tc>
         <w:tc>
           <w:tcPr>
-            <w:tcW w:w="4749" w:type="dxa"/>
+            <w:tcW w:w="5386" w:type="dxa"/>
             <w:vAlign w:val="center"/>
           </w:tcPr>
           <w:p>
             <w:pPr>
+              <w:spacing w:line="480" w:lineRule="auto"/>
+              <w:ind w:left="850" w:right="567" w:firstLine="284"/>
               <w:jc w:val="center"/>
               <w:rPr>
                 <w:sz w:val="24"/>
@@ -2102,51 +2301,12 @@
             </w:r>
           </w:p>
         </w:tc>
-        <w:tc>
-          <w:tcPr>
-            <w:tcW w:w="0" w:type="auto"/>
-          </w:tcPr>
-          <w:p>
-            <w:pPr>
-              <w:rPr>
-                <w:sz w:val="24"/>
-                <w:szCs w:val="24"/>
-                <w:lang w:val="en-PH"/>
-              </w:rPr>
-            </w:pPr>
-          </w:p>
-        </w:tc>
       </w:tr>
     </w:tbl>
     <w:p>
       <w:pPr>
-        <w:rPr>
-          <w:sz w:val="24"/>
-          <w:szCs w:val="24"/>
-          <w:lang w:val="en-PH"/>
-        </w:rPr>
-      </w:pPr>
-    </w:p>
-    <w:p>
-      <w:pPr>
-        <w:rPr>
-          <w:sz w:val="24"/>
-          <w:szCs w:val="24"/>
-          <w:lang w:val="en-PH"/>
-        </w:rPr>
-      </w:pPr>
-    </w:p>
-    <w:p>
-      <w:pPr>
-        <w:rPr>
-          <w:sz w:val="24"/>
-          <w:szCs w:val="24"/>
-          <w:lang w:val="en-PH"/>
-        </w:rPr>
-      </w:pPr>
-    </w:p>
-    <w:p>
-      <w:pPr>
+        <w:spacing w:line="480" w:lineRule="auto"/>
+        <w:ind w:left="850" w:right="567" w:firstLine="284"/>
         <w:jc w:val="both"/>
         <w:rPr>
           <w:sz w:val="24"/>
@@ -2154,14 +2314,18 @@
           <w:lang w:val="en-PH"/>
         </w:rPr>
       </w:pPr>
-      <w:r>
-        <w:rPr>
-          <w:sz w:val="24"/>
-          <w:szCs w:val="24"/>
-          <w:lang w:val="en-PH"/>
-        </w:rPr>
-        <w:tab/>
-      </w:r>
+    </w:p>
+    <w:p>
+      <w:pPr>
+        <w:spacing w:line="480" w:lineRule="auto"/>
+        <w:ind w:left="850" w:right="567" w:firstLine="284"/>
+        <w:jc w:val="both"/>
+        <w:rPr>
+          <w:sz w:val="24"/>
+          <w:szCs w:val="24"/>
+          <w:lang w:val="en-PH"/>
+        </w:rPr>
+      </w:pPr>
       <w:r>
         <w:rPr>
           <w:sz w:val="24"/>
@@ -2173,52 +2337,41 @@
     </w:p>
     <w:p>
       <w:pPr>
-        <w:rPr>
-          <w:sz w:val="24"/>
-          <w:szCs w:val="24"/>
-          <w:lang w:val="en-PH"/>
-        </w:rPr>
-      </w:pPr>
-    </w:p>
-    <w:p>
-      <w:pPr>
-        <w:rPr>
-          <w:sz w:val="24"/>
-          <w:szCs w:val="24"/>
-          <w:lang w:val="en-PH"/>
-        </w:rPr>
-      </w:pPr>
-    </w:p>
-    <w:p>
-      <w:pPr>
+        <w:spacing w:line="480" w:lineRule="auto"/>
+        <w:ind w:left="850" w:right="567" w:firstLine="284"/>
+        <w:jc w:val="both"/>
+        <w:rPr>
+          <w:sz w:val="24"/>
+          <w:szCs w:val="24"/>
+          <w:lang w:val="en-PH"/>
+        </w:rPr>
+      </w:pPr>
+    </w:p>
+    <w:p>
+      <w:pPr>
+        <w:spacing w:line="480" w:lineRule="auto"/>
+        <w:ind w:left="851" w:right="567"/>
         <w:rPr>
           <w:b/>
           <w:bCs/>
-          <w:sz w:val="40"/>
-          <w:szCs w:val="40"/>
+          <w:sz w:val="24"/>
+          <w:szCs w:val="24"/>
         </w:rPr>
       </w:pPr>
       <w:r>
         <w:rPr>
           <w:b/>
           <w:bCs/>
-          <w:sz w:val="40"/>
-          <w:szCs w:val="40"/>
+          <w:sz w:val="24"/>
+          <w:szCs w:val="24"/>
         </w:rPr>
         <w:t>Ethical Consideration</w:t>
       </w:r>
     </w:p>
     <w:p>
       <w:pPr>
-        <w:rPr>
-          <w:sz w:val="24"/>
-          <w:szCs w:val="24"/>
-          <w:lang w:val="en-PH"/>
-        </w:rPr>
-      </w:pPr>
-    </w:p>
-    <w:p>
-      <w:pPr>
+        <w:spacing w:line="480" w:lineRule="auto"/>
+        <w:ind w:left="850" w:right="567" w:firstLine="284"/>
         <w:jc w:val="both"/>
         <w:rPr>
           <w:sz w:val="24"/>
@@ -2304,16 +2457,8 @@
     </w:p>
     <w:p>
       <w:pPr>
-        <w:jc w:val="both"/>
-        <w:rPr>
-          <w:sz w:val="24"/>
-          <w:szCs w:val="24"/>
-          <w:lang w:val="en-PH"/>
-        </w:rPr>
-      </w:pPr>
-    </w:p>
-    <w:p>
-      <w:pPr>
+        <w:spacing w:line="480" w:lineRule="auto"/>
+        <w:ind w:left="850" w:right="567" w:firstLine="284"/>
         <w:jc w:val="both"/>
         <w:rPr>
           <w:sz w:val="24"/>
@@ -2333,6 +2478,8 @@
     </w:p>
     <w:p>
       <w:pPr>
+        <w:spacing w:line="480" w:lineRule="auto"/>
+        <w:ind w:left="850" w:right="567" w:firstLine="284"/>
         <w:jc w:val="both"/>
         <w:rPr>
           <w:sz w:val="24"/>
@@ -2343,6 +2490,8 @@
     </w:p>
     <w:p>
       <w:pPr>
+        <w:spacing w:line="480" w:lineRule="auto"/>
+        <w:ind w:left="850" w:right="567" w:firstLine="284"/>
         <w:jc w:val="both"/>
         <w:rPr>
           <w:sz w:val="24"/>
@@ -2357,21 +2506,68 @@
           <w:lang w:val="en-PH"/>
         </w:rPr>
         <w:tab/>
+      </w:r>
+    </w:p>
+    <w:p>
+      <w:pPr>
+        <w:spacing w:line="480" w:lineRule="auto"/>
+        <w:ind w:left="850" w:right="567" w:firstLine="284"/>
+        <w:jc w:val="both"/>
+        <w:rPr>
+          <w:sz w:val="24"/>
+          <w:szCs w:val="24"/>
+          <w:lang w:val="en-PH"/>
+        </w:rPr>
+      </w:pPr>
+    </w:p>
+    <w:p>
+      <w:pPr>
+        <w:spacing w:line="480" w:lineRule="auto"/>
+        <w:ind w:left="850" w:right="567" w:firstLine="284"/>
+        <w:jc w:val="both"/>
+        <w:rPr>
+          <w:sz w:val="24"/>
+          <w:szCs w:val="24"/>
+          <w:lang w:val="en-PH"/>
+        </w:rPr>
+      </w:pPr>
+    </w:p>
+    <w:p>
+      <w:pPr>
+        <w:spacing w:line="480" w:lineRule="auto"/>
+        <w:ind w:left="850" w:right="567" w:firstLine="284"/>
+        <w:jc w:val="both"/>
+        <w:rPr>
+          <w:sz w:val="24"/>
+          <w:szCs w:val="24"/>
+          <w:lang w:val="en-PH"/>
+        </w:rPr>
+      </w:pPr>
+    </w:p>
+    <w:p>
+      <w:pPr>
+        <w:spacing w:line="480" w:lineRule="auto"/>
+        <w:ind w:left="850" w:right="567" w:firstLine="284"/>
+        <w:jc w:val="both"/>
+        <w:rPr>
+          <w:sz w:val="24"/>
+          <w:szCs w:val="24"/>
+          <w:lang w:val="en-PH"/>
+        </w:rPr>
+      </w:pPr>
+      <w:r>
+        <w:rPr>
+          <w:sz w:val="24"/>
+          <w:szCs w:val="24"/>
+          <w:lang w:val="en-PH"/>
+        </w:rPr>
         <w:t>To ensure privacy and confidentiality, all information collected from the respondents will be treated with strict confidentiality. The identities of the participants will not be disclosed in any part of the research, and their responses will be presented in a general or summarized form only. Personal information, if any, will not be included in the final report.</w:t>
       </w:r>
     </w:p>
     <w:p>
       <w:pPr>
-        <w:jc w:val="both"/>
-        <w:rPr>
-          <w:sz w:val="24"/>
-          <w:szCs w:val="24"/>
-          <w:lang w:val="en-PH"/>
-        </w:rPr>
-      </w:pPr>
-    </w:p>
-    <w:p>
-      <w:pPr>
+        <w:spacing w:line="480" w:lineRule="auto"/>
+        <w:ind w:left="850" w:right="567" w:firstLine="284"/>
         <w:jc w:val="both"/>
         <w:rPr>
           <w:sz w:val="24"/>
@@ -2399,6 +2595,8 @@
     </w:p>
     <w:p>
       <w:pPr>
+        <w:spacing w:line="480" w:lineRule="auto"/>
+        <w:ind w:left="850" w:right="567" w:firstLine="284"/>
         <w:jc w:val="both"/>
         <w:rPr>
           <w:sz w:val="24"/>
@@ -2409,6 +2607,8 @@
     </w:p>
     <w:p>
       <w:pPr>
+        <w:spacing w:line="480" w:lineRule="auto"/>
+        <w:ind w:left="850" w:right="567" w:firstLine="284"/>
         <w:jc w:val="both"/>
         <w:rPr>
           <w:sz w:val="24"/>
@@ -2419,6 +2619,8 @@
     </w:p>
     <w:p>
       <w:pPr>
+        <w:spacing w:line="480" w:lineRule="auto"/>
+        <w:ind w:left="850" w:right="567" w:firstLine="284"/>
         <w:jc w:val="both"/>
         <w:rPr>
           <w:sz w:val="24"/>
@@ -2429,6 +2631,8 @@
     </w:p>
     <w:p>
       <w:pPr>
+        <w:spacing w:line="480" w:lineRule="auto"/>
+        <w:ind w:left="850" w:right="567" w:firstLine="284"/>
         <w:jc w:val="both"/>
         <w:rPr>
           <w:sz w:val="24"/>
@@ -2439,6 +2643,8 @@
     </w:p>
     <w:p>
       <w:pPr>
+        <w:spacing w:line="480" w:lineRule="auto"/>
+        <w:ind w:left="850" w:right="567" w:firstLine="284"/>
         <w:jc w:val="both"/>
         <w:rPr>
           <w:sz w:val="24"/>
@@ -2449,6 +2655,8 @@
     </w:p>
     <w:p>
       <w:pPr>
+        <w:spacing w:line="480" w:lineRule="auto"/>
+        <w:ind w:left="850" w:right="567" w:firstLine="284"/>
         <w:jc w:val="both"/>
         <w:rPr>
           <w:sz w:val="24"/>
@@ -2459,6 +2667,8 @@
     </w:p>
     <w:p>
       <w:pPr>
+        <w:spacing w:line="480" w:lineRule="auto"/>
+        <w:ind w:left="850" w:right="567" w:firstLine="284"/>
         <w:jc w:val="both"/>
         <w:rPr>
           <w:sz w:val="24"/>
@@ -2469,6 +2679,8 @@
     </w:p>
     <w:p>
       <w:pPr>
+        <w:spacing w:line="480" w:lineRule="auto"/>
+        <w:ind w:left="850" w:right="567" w:firstLine="284"/>
         <w:jc w:val="both"/>
         <w:rPr>
           <w:sz w:val="24"/>
@@ -2479,6 +2691,8 @@
     </w:p>
     <w:p>
       <w:pPr>
+        <w:spacing w:line="480" w:lineRule="auto"/>
+        <w:ind w:left="850" w:right="567" w:firstLine="284"/>
         <w:jc w:val="both"/>
         <w:rPr>
           <w:sz w:val="24"/>
@@ -2489,6 +2703,8 @@
     </w:p>
     <w:p>
       <w:pPr>
+        <w:spacing w:line="480" w:lineRule="auto"/>
+        <w:ind w:left="850" w:right="567" w:firstLine="284"/>
         <w:jc w:val="both"/>
         <w:rPr>
           <w:sz w:val="24"/>
@@ -2499,6 +2715,8 @@
     </w:p>
     <w:p>
       <w:pPr>
+        <w:spacing w:line="480" w:lineRule="auto"/>
+        <w:ind w:left="850" w:right="567" w:firstLine="284"/>
         <w:jc w:val="both"/>
         <w:rPr>
           <w:sz w:val="24"/>
@@ -2509,6 +2727,8 @@
     </w:p>
     <w:p>
       <w:pPr>
+        <w:spacing w:line="480" w:lineRule="auto"/>
+        <w:ind w:left="850" w:right="567" w:firstLine="284"/>
         <w:jc w:val="both"/>
         <w:rPr>
           <w:sz w:val="24"/>
@@ -2519,6 +2739,8 @@
     </w:p>
     <w:p>
       <w:pPr>
+        <w:spacing w:line="480" w:lineRule="auto"/>
+        <w:ind w:left="850" w:right="567" w:firstLine="284"/>
         <w:jc w:val="both"/>
         <w:rPr>
           <w:sz w:val="24"/>
@@ -2529,6 +2751,8 @@
     </w:p>
     <w:p>
       <w:pPr>
+        <w:spacing w:line="480" w:lineRule="auto"/>
+        <w:ind w:left="850" w:right="567" w:firstLine="284"/>
         <w:jc w:val="both"/>
         <w:rPr>
           <w:sz w:val="24"/>
@@ -2539,6 +2763,8 @@
     </w:p>
     <w:p>
       <w:pPr>
+        <w:spacing w:line="480" w:lineRule="auto"/>
+        <w:ind w:left="850" w:right="567" w:firstLine="284"/>
         <w:jc w:val="both"/>
         <w:rPr>
           <w:sz w:val="24"/>
@@ -2549,433 +2775,27 @@
     </w:p>
     <w:p>
       <w:pPr>
-        <w:spacing w:after="240"/>
+        <w:spacing w:after="240" w:line="480" w:lineRule="auto"/>
+        <w:ind w:left="850" w:right="567" w:firstLine="284"/>
         <w:jc w:val="center"/>
         <w:rPr>
           <w:b/>
           <w:bCs/>
-          <w:sz w:val="72"/>
-          <w:szCs w:val="72"/>
-        </w:rPr>
-      </w:pPr>
-    </w:p>
-    <w:p>
-      <w:pPr>
-        <w:spacing w:after="240"/>
-        <w:jc w:val="center"/>
+          <w:sz w:val="24"/>
+          <w:szCs w:val="24"/>
+        </w:rPr>
+      </w:pPr>
+    </w:p>
+    <w:p>
+      <w:pPr>
+        <w:spacing w:line="480" w:lineRule="auto"/>
+        <w:ind w:left="850" w:right="567" w:firstLine="284"/>
+        <w:jc w:val="both"/>
         <w:rPr>
           <w:b/>
           <w:bCs/>
-          <w:sz w:val="72"/>
-          <w:szCs w:val="72"/>
-        </w:rPr>
-      </w:pPr>
-      <w:r>
-        <w:rPr>
-          <w:b/>
-          <w:bCs/>
-          <w:sz w:val="72"/>
-          <w:szCs w:val="72"/>
-        </w:rPr>
-        <w:t>Web-Based Inventory and Point-of-Sale System for MMB Drug Store</w:t>
-      </w:r>
-    </w:p>
-    <w:p>
-      <w:pPr>
-        <w:pStyle w:val="BodyText"/>
-        <w:jc w:val="center"/>
-        <w:rPr>
-          <w:b/>
-          <w:bCs/>
-          <w:sz w:val="72"/>
-          <w:szCs w:val="72"/>
-        </w:rPr>
-      </w:pPr>
-    </w:p>
-    <w:p>
-      <w:pPr>
-        <w:pStyle w:val="BodyText"/>
-        <w:jc w:val="center"/>
-        <w:rPr>
-          <w:b/>
-          <w:bCs/>
-          <w:sz w:val="40"/>
-          <w:szCs w:val="40"/>
-        </w:rPr>
-      </w:pPr>
-    </w:p>
-    <w:p>
-      <w:pPr>
-        <w:pStyle w:val="BodyText"/>
-        <w:jc w:val="center"/>
-        <w:rPr>
-          <w:b/>
-          <w:bCs/>
-          <w:sz w:val="40"/>
-          <w:szCs w:val="40"/>
-        </w:rPr>
-      </w:pPr>
-    </w:p>
-    <w:p>
-      <w:pPr>
-        <w:pStyle w:val="BodyText"/>
-        <w:jc w:val="center"/>
-        <w:rPr>
-          <w:b/>
-          <w:bCs/>
-          <w:sz w:val="40"/>
-          <w:szCs w:val="40"/>
-        </w:rPr>
-      </w:pPr>
-    </w:p>
-    <w:p>
-      <w:pPr>
-        <w:pStyle w:val="BodyText"/>
-        <w:jc w:val="center"/>
-        <w:rPr>
-          <w:b/>
-          <w:bCs/>
-          <w:sz w:val="40"/>
-          <w:szCs w:val="40"/>
-        </w:rPr>
-      </w:pPr>
-    </w:p>
-    <w:p>
-      <w:pPr>
-        <w:pStyle w:val="BodyText"/>
-        <w:jc w:val="center"/>
-        <w:rPr>
-          <w:b/>
-          <w:bCs/>
-          <w:sz w:val="40"/>
-          <w:szCs w:val="40"/>
-        </w:rPr>
-      </w:pPr>
-    </w:p>
-    <w:p>
-      <w:pPr>
-        <w:pStyle w:val="BodyText"/>
-        <w:jc w:val="center"/>
-        <w:rPr>
-          <w:sz w:val="60"/>
-          <w:szCs w:val="60"/>
-        </w:rPr>
-      </w:pPr>
-      <w:r>
-        <w:rPr>
-          <w:sz w:val="60"/>
-          <w:szCs w:val="60"/>
-        </w:rPr>
-        <w:t>Chapter</w:t>
-      </w:r>
-      <w:r>
-        <w:rPr>
-          <w:sz w:val="60"/>
-          <w:szCs w:val="60"/>
-        </w:rPr>
-        <w:t xml:space="preserve"> 2</w:t>
-      </w:r>
-    </w:p>
-    <w:p>
-      <w:pPr>
-        <w:pStyle w:val="BodyText"/>
-        <w:jc w:val="center"/>
-        <w:rPr>
-          <w:b/>
-          <w:bCs/>
-          <w:sz w:val="40"/>
-          <w:szCs w:val="40"/>
-        </w:rPr>
-      </w:pPr>
-    </w:p>
-    <w:p>
-      <w:pPr>
-        <w:pStyle w:val="BodyText"/>
-        <w:jc w:val="center"/>
-        <w:rPr>
-          <w:b/>
-          <w:bCs/>
-          <w:sz w:val="40"/>
-          <w:szCs w:val="40"/>
-        </w:rPr>
-      </w:pPr>
-    </w:p>
-    <w:p>
-      <w:pPr>
-        <w:pStyle w:val="BodyText"/>
-        <w:jc w:val="center"/>
-        <w:rPr>
-          <w:b/>
-          <w:bCs/>
-          <w:sz w:val="40"/>
-          <w:szCs w:val="40"/>
-        </w:rPr>
-      </w:pPr>
-    </w:p>
-    <w:p>
-      <w:pPr>
-        <w:pStyle w:val="BodyText"/>
-        <w:jc w:val="center"/>
-        <w:rPr>
-          <w:sz w:val="40"/>
-          <w:szCs w:val="40"/>
-        </w:rPr>
-      </w:pPr>
-      <w:r>
-        <w:rPr>
-          <w:sz w:val="40"/>
-          <w:szCs w:val="40"/>
-        </w:rPr>
-        <w:t>Pablo Andrew G.</w:t>
-      </w:r>
-    </w:p>
-    <w:p>
-      <w:pPr>
-        <w:pStyle w:val="BodyText"/>
-        <w:jc w:val="center"/>
-        <w:rPr>
-          <w:sz w:val="40"/>
-          <w:szCs w:val="40"/>
-        </w:rPr>
-      </w:pPr>
-      <w:proofErr w:type="spellStart"/>
-      <w:r>
-        <w:rPr>
-          <w:sz w:val="40"/>
-          <w:szCs w:val="40"/>
-        </w:rPr>
-        <w:t>Palero</w:t>
-      </w:r>
-      <w:proofErr w:type="spellEnd"/>
-      <w:r>
-        <w:rPr>
-          <w:sz w:val="40"/>
-          <w:szCs w:val="40"/>
-        </w:rPr>
-        <w:t xml:space="preserve"> Jhon Bryan F.</w:t>
-      </w:r>
-    </w:p>
-    <w:p>
-      <w:pPr>
-        <w:pStyle w:val="BodyText"/>
-        <w:jc w:val="center"/>
-        <w:rPr>
-          <w:sz w:val="40"/>
-          <w:szCs w:val="40"/>
-        </w:rPr>
-      </w:pPr>
-      <w:r>
-        <w:rPr>
-          <w:sz w:val="40"/>
-          <w:szCs w:val="40"/>
-        </w:rPr>
-        <w:t>Cabrera Neil Paolo N.</w:t>
-      </w:r>
-    </w:p>
-    <w:p>
-      <w:pPr>
-        <w:pStyle w:val="BodyText"/>
-        <w:jc w:val="center"/>
-        <w:rPr>
-          <w:sz w:val="40"/>
-          <w:szCs w:val="40"/>
-        </w:rPr>
-      </w:pPr>
-    </w:p>
-    <w:p>
-      <w:pPr>
-        <w:pStyle w:val="BodyText"/>
-        <w:jc w:val="center"/>
-        <w:rPr>
-          <w:sz w:val="40"/>
-          <w:szCs w:val="40"/>
-        </w:rPr>
-      </w:pPr>
-    </w:p>
-    <w:p>
-      <w:pPr>
-        <w:pStyle w:val="BodyText"/>
-        <w:jc w:val="center"/>
-        <w:rPr>
-          <w:sz w:val="40"/>
-          <w:szCs w:val="40"/>
-        </w:rPr>
-      </w:pPr>
-    </w:p>
-    <w:p>
-      <w:pPr>
-        <w:pStyle w:val="BodyText"/>
-        <w:jc w:val="center"/>
-        <w:rPr>
-          <w:sz w:val="40"/>
-          <w:szCs w:val="40"/>
-        </w:rPr>
-      </w:pPr>
-      <w:r>
-        <w:rPr>
-          <w:sz w:val="40"/>
-          <w:szCs w:val="40"/>
-        </w:rPr>
-        <w:t>Capstone Professor</w:t>
-      </w:r>
-    </w:p>
-    <w:p>
-      <w:pPr>
-        <w:pStyle w:val="BodyText"/>
-        <w:jc w:val="center"/>
-        <w:rPr>
-          <w:sz w:val="40"/>
-          <w:szCs w:val="40"/>
-        </w:rPr>
-      </w:pPr>
-      <w:r>
-        <w:rPr>
-          <w:sz w:val="40"/>
-          <w:szCs w:val="40"/>
-        </w:rPr>
-        <w:t>Garcia Marvin D.G</w:t>
-      </w:r>
-    </w:p>
-    <w:p>
-      <w:pPr>
-        <w:jc w:val="both"/>
-        <w:rPr>
-          <w:b/>
-          <w:bCs/>
-          <w:sz w:val="60"/>
-          <w:szCs w:val="60"/>
-          <w:lang w:val="en-PH"/>
-        </w:rPr>
-      </w:pPr>
-    </w:p>
-    <w:p>
-      <w:pPr>
-        <w:jc w:val="both"/>
-        <w:rPr>
-          <w:b/>
-          <w:bCs/>
-          <w:sz w:val="60"/>
-          <w:szCs w:val="60"/>
-          <w:lang w:val="en-PH"/>
-        </w:rPr>
-      </w:pPr>
-    </w:p>
-    <w:p>
-      <w:pPr>
-        <w:jc w:val="both"/>
-        <w:rPr>
-          <w:b/>
-          <w:bCs/>
-          <w:sz w:val="60"/>
-          <w:szCs w:val="60"/>
-          <w:lang w:val="en-PH"/>
-        </w:rPr>
-      </w:pPr>
-    </w:p>
-    <w:p>
-      <w:pPr>
-        <w:jc w:val="both"/>
-        <w:rPr>
-          <w:b/>
-          <w:bCs/>
-          <w:sz w:val="60"/>
-          <w:szCs w:val="60"/>
-          <w:lang w:val="en-PH"/>
-        </w:rPr>
-      </w:pPr>
-    </w:p>
-    <w:p>
-      <w:pPr>
-        <w:jc w:val="both"/>
-        <w:rPr>
-          <w:b/>
-          <w:bCs/>
-          <w:sz w:val="60"/>
-          <w:szCs w:val="60"/>
-          <w:lang w:val="en-PH"/>
-        </w:rPr>
-      </w:pPr>
-    </w:p>
-    <w:p>
-      <w:pPr>
-        <w:jc w:val="both"/>
-        <w:rPr>
-          <w:b/>
-          <w:bCs/>
-          <w:sz w:val="60"/>
-          <w:szCs w:val="60"/>
-          <w:lang w:val="en-PH"/>
-        </w:rPr>
-      </w:pPr>
-    </w:p>
-    <w:p>
-      <w:pPr>
-        <w:jc w:val="both"/>
-        <w:rPr>
-          <w:b/>
-          <w:bCs/>
-          <w:sz w:val="60"/>
-          <w:szCs w:val="60"/>
-          <w:lang w:val="en-PH"/>
-        </w:rPr>
-      </w:pPr>
-    </w:p>
-    <w:p>
-      <w:pPr>
-        <w:jc w:val="both"/>
-        <w:rPr>
-          <w:b/>
-          <w:bCs/>
-          <w:sz w:val="60"/>
-          <w:szCs w:val="60"/>
-          <w:lang w:val="en-PH"/>
-        </w:rPr>
-      </w:pPr>
-    </w:p>
-    <w:p>
-      <w:pPr>
-        <w:jc w:val="both"/>
-        <w:rPr>
-          <w:b/>
-          <w:bCs/>
-          <w:sz w:val="60"/>
-          <w:szCs w:val="60"/>
-          <w:lang w:val="en-PH"/>
-        </w:rPr>
-      </w:pPr>
-    </w:p>
-    <w:p>
-      <w:pPr>
-        <w:jc w:val="both"/>
-        <w:rPr>
-          <w:b/>
-          <w:bCs/>
-          <w:sz w:val="60"/>
-          <w:szCs w:val="60"/>
-          <w:lang w:val="en-PH"/>
-        </w:rPr>
-      </w:pPr>
-    </w:p>
-    <w:p>
-      <w:pPr>
-        <w:jc w:val="both"/>
-        <w:rPr>
-          <w:b/>
-          <w:bCs/>
-          <w:sz w:val="60"/>
-          <w:szCs w:val="60"/>
-          <w:lang w:val="en-PH"/>
-        </w:rPr>
-      </w:pPr>
-    </w:p>
-    <w:p>
-      <w:pPr>
-        <w:jc w:val="both"/>
-        <w:rPr>
-          <w:b/>
-          <w:bCs/>
-          <w:sz w:val="60"/>
-          <w:szCs w:val="60"/>
+          <w:sz w:val="24"/>
+          <w:szCs w:val="24"/>
           <w:lang w:val="en-PH"/>
         </w:rPr>
       </w:pPr>
@@ -2984,7 +2804,7 @@
       <w:headerReference w:type="default" r:id="rId8"/>
       <w:footerReference w:type="default" r:id="rId9"/>
       <w:pgSz w:w="12240" w:h="15840" w:code="1"/>
-      <w:pgMar w:top="1380" w:right="1700" w:bottom="1360" w:left="992" w:header="9" w:footer="1166" w:gutter="0"/>
+      <w:pgMar w:top="567" w:right="567" w:bottom="567" w:left="851" w:header="11" w:footer="1168" w:gutter="0"/>
       <w:cols w:space="720"/>
       <w:docGrid w:linePitch="299"/>
     </w:sectPr>
@@ -10077,7 +9897,6 @@
   <w:style w:type="character" w:default="1" w:styleId="DefaultParagraphFont">
     <w:name w:val="Default Paragraph Font"/>
     <w:uiPriority w:val="1"/>
-    <w:semiHidden/>
     <w:unhideWhenUsed/>
   </w:style>
   <w:style w:type="table" w:default="1" w:styleId="TableNormal">

</xml_diff>